<commit_message>
predi nowi css filowe
</commit_message>
<xml_diff>
--- a/documentation/musicshop_doc/final/full_documentation_musicshop.docx
+++ b/documentation/musicshop_doc/final/full_documentation_musicshop.docx
@@ -21,7 +21,6 @@
           <w:sz w:val="28"/>
           <w:szCs w:val="28"/>
         </w:rPr>
-        <w:t>СОФИЙСКА ПРОФЕСИОНАЛНА ГИМНАЗИЯ ПО ЕЛЕКТРОНИКА „ДЖОН АТАНАСОВ“</w:t>
       </w:r>
     </w:p>
     <w:p>
@@ -626,9 +625,6 @@
           <w:szCs w:val="24"/>
         </w:rPr>
       </w:r>
-      <w:r>
-        <w:br w:type="page"/>
-      </w:r>
     </w:p>
     <w:p>
       <w:pPr>
@@ -636,15 +632,13 @@
         <w:spacing w:lineRule="auto" w:line="360" w:before="0" w:after="0"/>
         <w:rPr>
           <w:rFonts w:ascii="Times New Roman" w:hAnsi="Times New Roman" w:cs="Times New Roman"/>
-          <w:b/>
-          <w:sz w:val="24"/>
-          <w:szCs w:val="24"/>
-        </w:rPr>
-      </w:pPr>
-      <w:r>
-        <w:rPr>
-          <w:rFonts w:cs="Times New Roman"/>
-          <w:b/>
+          <w:sz w:val="24"/>
+          <w:szCs w:val="24"/>
+        </w:rPr>
+      </w:pPr>
+      <w:r>
+        <w:rPr>
+          <w:rFonts w:cs="Times New Roman"/>
           <w:sz w:val="24"/>
           <w:szCs w:val="24"/>
         </w:rPr>
@@ -701,7 +695,7 @@
           <w:r>
             <w:rPr/>
             <w:tab/>
-            <w:t>5</w:t>
+            <w:t>4</w:t>
           </w:r>
         </w:p>
         <w:p>
@@ -717,7 +711,7 @@
             <w:rPr/>
             <w:t>1.1. Задание за разработка</w:t>
             <w:tab/>
-            <w:t>5</w:t>
+            <w:t>4</w:t>
           </w:r>
         </w:p>
         <w:p>
@@ -733,7 +727,7 @@
             <w:rPr/>
             <w:t>1.2. Анализ на заданието</w:t>
             <w:tab/>
-            <w:t>6</w:t>
+            <w:t>5</w:t>
           </w:r>
         </w:p>
         <w:p>
@@ -749,7 +743,7 @@
             <w:rPr/>
             <w:t>1.3. Поставени цели</w:t>
             <w:tab/>
-            <w:t>7</w:t>
+            <w:t>6</w:t>
           </w:r>
         </w:p>
         <w:p>
@@ -765,7 +759,7 @@
             <w:rPr/>
             <w:t>1.4. Очаквани резултати</w:t>
             <w:tab/>
-            <w:t>8</w:t>
+            <w:t>7</w:t>
           </w:r>
         </w:p>
         <w:p>
@@ -781,7 +775,7 @@
             <w:rPr/>
             <w:t>2. ОСНОВНА ЧАСТ</w:t>
             <w:tab/>
-            <w:t>10</w:t>
+            <w:t>8</w:t>
           </w:r>
         </w:p>
         <w:p>
@@ -797,7 +791,7 @@
             <w:rPr/>
             <w:t>2.1. Избор на технологии</w:t>
             <w:tab/>
-            <w:t>10</w:t>
+            <w:t>8</w:t>
           </w:r>
         </w:p>
         <w:p>
@@ -813,7 +807,7 @@
             <w:rPr/>
             <w:t>2.1.1. Избор на програмен език</w:t>
             <w:tab/>
-            <w:t>11</w:t>
+            <w:t>10</w:t>
           </w:r>
         </w:p>
         <w:p>
@@ -829,7 +823,7 @@
             <w:rPr/>
             <w:t>2.1.2. Избор на технология за сървъра</w:t>
             <w:tab/>
-            <w:t>14</w:t>
+            <w:t>12</w:t>
           </w:r>
         </w:p>
         <w:p>
@@ -845,7 +839,7 @@
             <w:rPr/>
             <w:t>2.1.3. Избор на технология за базата данни</w:t>
             <w:tab/>
-            <w:t>17</w:t>
+            <w:t>15</w:t>
           </w:r>
         </w:p>
         <w:p>
@@ -861,7 +855,7 @@
             <w:rPr/>
             <w:t>2.2. Софтуерен дизайн</w:t>
             <w:tab/>
-            <w:t>20</w:t>
+            <w:t>17</w:t>
           </w:r>
         </w:p>
         <w:p>
@@ -877,7 +871,7 @@
             <w:rPr/>
             <w:t>2.2.1. Етапи на разработка</w:t>
             <w:tab/>
-            <w:t>20</w:t>
+            <w:t>17</w:t>
           </w:r>
         </w:p>
         <w:p>
@@ -893,7 +887,7 @@
             <w:rPr/>
             <w:t>2.2.2. Софтуерна архитектура</w:t>
             <w:tab/>
-            <w:t>27</w:t>
+            <w:t>24</w:t>
           </w:r>
         </w:p>
         <w:p>
@@ -909,7 +903,7 @@
             <w:rPr/>
             <w:t>2.2.3. Описание и взаимодействие с приложението</w:t>
             <w:tab/>
-            <w:t>29</w:t>
+            <w:t>26</w:t>
           </w:r>
         </w:p>
         <w:p>
@@ -925,7 +919,7 @@
             <w:rPr/>
             <w:t>2.2.4. Графичен дизайн и структура на приложението</w:t>
             <w:tab/>
-            <w:t>31</w:t>
+            <w:t>28</w:t>
           </w:r>
         </w:p>
         <w:p>
@@ -941,7 +935,7 @@
             <w:rPr/>
             <w:t>2.2.5. Дизайн на сървъра</w:t>
             <w:tab/>
-            <w:t>35</w:t>
+            <w:t>32</w:t>
           </w:r>
         </w:p>
         <w:p>
@@ -957,7 +951,23 @@
             <w:rPr/>
             <w:t>2.2.6. Дизайн на базата данни</w:t>
             <w:tab/>
-            <w:t>37</w:t>
+            <w:t>34</w:t>
+          </w:r>
+        </w:p>
+        <w:p>
+          <w:pPr>
+            <w:pStyle w:val="TOC3"/>
+            <w:tabs>
+              <w:tab w:val="clear" w:pos="8505"/>
+              <w:tab w:val="right" w:pos="9071" w:leader="dot"/>
+            </w:tabs>
+            <w:rPr/>
+          </w:pPr>
+          <w:r>
+            <w:rPr/>
+            <w:t>2.2.7. CRUD заявки</w:t>
+            <w:tab/>
+            <w:t>38</w:t>
           </w:r>
         </w:p>
         <w:p>
@@ -973,7 +983,7 @@
             <w:rPr/>
             <w:t>2.3. Тестване</w:t>
             <w:tab/>
-            <w:t>47</w:t>
+            <w:t>42</w:t>
           </w:r>
         </w:p>
         <w:p>
@@ -989,7 +999,7 @@
             <w:rPr/>
             <w:t>3. ЗАКЛЮЧЕНИЕ</w:t>
             <w:tab/>
-            <w:t>49</w:t>
+            <w:t>44</w:t>
           </w:r>
         </w:p>
         <w:p>
@@ -1005,7 +1015,7 @@
             <w:rPr/>
             <w:t>3.1. Постигнати цели</w:t>
             <w:tab/>
-            <w:t>49</w:t>
+            <w:t>44</w:t>
           </w:r>
         </w:p>
         <w:p>
@@ -1021,7 +1031,7 @@
             <w:rPr/>
             <w:t>3.2. Потенциално развитие</w:t>
             <w:tab/>
-            <w:t>50</w:t>
+            <w:t>45</w:t>
           </w:r>
         </w:p>
         <w:p>
@@ -1037,7 +1047,7 @@
             <w:rPr/>
             <w:t>4. ИЗТОЧНИЦИ</w:t>
             <w:tab/>
-            <w:t>52</w:t>
+            <w:t>46</w:t>
           </w:r>
         </w:p>
         <w:p>
@@ -1053,7 +1063,167 @@
             <w:rPr/>
             <w:t>5. ПРИЛОЖИЕНИЯ</w:t>
             <w:tab/>
-            <w:t>53</w:t>
+            <w:t>47</w:t>
+          </w:r>
+        </w:p>
+        <w:p>
+          <w:pPr>
+            <w:pStyle w:val="TOC2"/>
+            <w:tabs>
+              <w:tab w:val="clear" w:pos="708"/>
+              <w:tab w:val="right" w:pos="9071" w:leader="dot"/>
+            </w:tabs>
+            <w:rPr/>
+          </w:pPr>
+          <w:r>
+            <w:rPr/>
+            <w:t>5.1. Начална страница в светъл и тъмен вариант</w:t>
+            <w:tab/>
+            <w:t>47</w:t>
+          </w:r>
+        </w:p>
+        <w:p>
+          <w:pPr>
+            <w:pStyle w:val="TOC2"/>
+            <w:tabs>
+              <w:tab w:val="clear" w:pos="708"/>
+              <w:tab w:val="right" w:pos="9071" w:leader="dot"/>
+            </w:tabs>
+            <w:rPr/>
+          </w:pPr>
+          <w:r>
+            <w:rPr/>
+            <w:t>5.2. Страница с продуктите в сайта</w:t>
+            <w:tab/>
+            <w:t>48</w:t>
+          </w:r>
+        </w:p>
+        <w:p>
+          <w:pPr>
+            <w:pStyle w:val="TOC2"/>
+            <w:tabs>
+              <w:tab w:val="clear" w:pos="708"/>
+              <w:tab w:val="right" w:pos="9071" w:leader="dot"/>
+            </w:tabs>
+            <w:rPr/>
+          </w:pPr>
+          <w:r>
+            <w:rPr/>
+            <w:t>5.3. Страница на отделен продукт</w:t>
+            <w:tab/>
+            <w:t>48</w:t>
+          </w:r>
+        </w:p>
+        <w:p>
+          <w:pPr>
+            <w:pStyle w:val="TOC2"/>
+            <w:tabs>
+              <w:tab w:val="clear" w:pos="708"/>
+              <w:tab w:val="right" w:pos="9071" w:leader="dot"/>
+            </w:tabs>
+            <w:rPr/>
+          </w:pPr>
+          <w:r>
+            <w:rPr/>
+            <w:t>5.4. Страница с любими</w:t>
+            <w:tab/>
+            <w:t>49</w:t>
+          </w:r>
+        </w:p>
+        <w:p>
+          <w:pPr>
+            <w:pStyle w:val="TOC2"/>
+            <w:tabs>
+              <w:tab w:val="clear" w:pos="708"/>
+              <w:tab w:val="right" w:pos="9071" w:leader="dot"/>
+            </w:tabs>
+            <w:rPr/>
+          </w:pPr>
+          <w:r>
+            <w:rPr/>
+            <w:t>5.5. Страница с количка на клиент</w:t>
+            <w:tab/>
+            <w:t>49</w:t>
+          </w:r>
+        </w:p>
+        <w:p>
+          <w:pPr>
+            <w:pStyle w:val="TOC2"/>
+            <w:tabs>
+              <w:tab w:val="clear" w:pos="708"/>
+              <w:tab w:val="right" w:pos="9071" w:leader="dot"/>
+            </w:tabs>
+            <w:rPr/>
+          </w:pPr>
+          <w:r>
+            <w:rPr/>
+            <w:t>5.6. Страница с поръчки на клиент</w:t>
+            <w:tab/>
+            <w:t>50</w:t>
+          </w:r>
+        </w:p>
+        <w:p>
+          <w:pPr>
+            <w:pStyle w:val="TOC2"/>
+            <w:tabs>
+              <w:tab w:val="clear" w:pos="708"/>
+              <w:tab w:val="right" w:pos="9071" w:leader="dot"/>
+            </w:tabs>
+            <w:rPr/>
+          </w:pPr>
+          <w:r>
+            <w:rPr/>
+            <w:t>5.7. Страница с новини</w:t>
+            <w:tab/>
+            <w:t>50</w:t>
+          </w:r>
+        </w:p>
+        <w:p>
+          <w:pPr>
+            <w:pStyle w:val="TOC2"/>
+            <w:tabs>
+              <w:tab w:val="clear" w:pos="708"/>
+              <w:tab w:val="right" w:pos="9071" w:leader="dot"/>
+            </w:tabs>
+            <w:rPr/>
+          </w:pPr>
+          <w:r>
+            <w:rPr/>
+            <w:t>5.8. Администраторска страница</w:t>
+            <w:tab/>
+            <w:t>51</w:t>
+          </w:r>
+        </w:p>
+        <w:p>
+          <w:pPr>
+            <w:pStyle w:val="TOC2"/>
+            <w:tabs>
+              <w:tab w:val="clear" w:pos="708"/>
+              <w:tab w:val="right" w:pos="9071" w:leader="dot"/>
+            </w:tabs>
+            <w:rPr/>
+          </w:pPr>
+          <w:r>
+            <w:rPr/>
+            <w:t>5.9. Страница с всички поръчки (Администратор)</w:t>
+            <w:tab/>
+            <w:t>51</w:t>
+          </w:r>
+        </w:p>
+        <w:p>
+          <w:pPr>
+            <w:pStyle w:val="TOC2"/>
+            <w:tabs>
+              <w:tab w:val="clear" w:pos="708"/>
+              <w:tab w:val="right" w:pos="9071" w:leader="dot"/>
+            </w:tabs>
+            <w:rPr/>
+          </w:pPr>
+          <w:r>
+            <w:rPr/>
+            <w:t>5.10. Структура на базата данни</w:t>
+            <w:tab/>
+            <w:t>52</w:t>
           </w:r>
           <w:r>
             <w:rPr/>
@@ -1081,44 +1251,6 @@
           <w:szCs w:val="24"/>
         </w:rPr>
       </w:r>
-    </w:p>
-    <w:p>
-      <w:pPr>
-        <w:pStyle w:val="Normal"/>
-        <w:spacing w:lineRule="auto" w:line="360" w:before="0" w:after="0"/>
-        <w:rPr>
-          <w:rFonts w:ascii="Times New Roman" w:hAnsi="Times New Roman" w:cs="Times New Roman"/>
-          <w:sz w:val="24"/>
-          <w:szCs w:val="24"/>
-        </w:rPr>
-      </w:pPr>
-      <w:r>
-        <w:rPr>
-          <w:rFonts w:cs="Times New Roman"/>
-          <w:sz w:val="24"/>
-          <w:szCs w:val="24"/>
-        </w:rPr>
-      </w:r>
-    </w:p>
-    <w:p>
-      <w:pPr>
-        <w:pStyle w:val="Normal"/>
-        <w:spacing w:lineRule="auto" w:line="360" w:before="0" w:after="0"/>
-        <w:rPr>
-          <w:rFonts w:ascii="Times New Roman" w:hAnsi="Times New Roman" w:cs="Times New Roman"/>
-          <w:b/>
-          <w:sz w:val="24"/>
-          <w:szCs w:val="24"/>
-        </w:rPr>
-      </w:pPr>
-      <w:r>
-        <w:rPr>
-          <w:rFonts w:cs="Times New Roman"/>
-          <w:b/>
-          <w:sz w:val="24"/>
-          <w:szCs w:val="24"/>
-        </w:rPr>
-      </w:r>
       <w:r>
         <w:br w:type="page"/>
       </w:r>
@@ -1487,7 +1619,11 @@
         <w:spacing w:lineRule="auto" w:line="360" w:before="0" w:after="0"/>
         <w:ind w:firstLine="709"/>
         <w:jc w:val="both"/>
-        <w:rPr/>
+        <w:rPr>
+          <w:rFonts w:cs="Times New Roman"/>
+          <w:sz w:val="24"/>
+          <w:szCs w:val="24"/>
+        </w:rPr>
       </w:pPr>
       <w:r>
         <w:rPr>
@@ -1496,6 +1632,26 @@
           <w:szCs w:val="24"/>
         </w:rPr>
         <w:t>От техническа гледна точка анализът показва нужда от ясно разделяне между потребителски интерфейс, сървърна логика и база данни. Такъв подход улеснява поддръжката, тестването и бъдещото разширяване на системата. Използването на отделни API крайни точки за работа с продукти, поръчки, новини, регистрация, вход и любими позволява по-добра организация на кода и по-лесно проследяване на отговорностите в проекта.</w:t>
+      </w:r>
+    </w:p>
+    <w:p>
+      <w:pPr>
+        <w:pStyle w:val="Normal"/>
+        <w:spacing w:lineRule="auto" w:line="360" w:before="0" w:after="0"/>
+        <w:ind w:firstLine="709"/>
+        <w:jc w:val="both"/>
+        <w:rPr>
+          <w:rFonts w:cs="Times New Roman"/>
+          <w:sz w:val="24"/>
+          <w:szCs w:val="24"/>
+        </w:rPr>
+      </w:pPr>
+      <w:r>
+        <w:rPr>
+          <w:rFonts w:cs="Times New Roman"/>
+          <w:sz w:val="24"/>
+          <w:szCs w:val="24"/>
+        </w:rPr>
       </w:r>
     </w:p>
     <w:p>
@@ -1681,26 +1837,6 @@
     </w:p>
     <w:p>
       <w:pPr>
-        <w:pStyle w:val="Normal"/>
-        <w:spacing w:lineRule="auto" w:line="360" w:before="0" w:after="0"/>
-        <w:ind w:firstLine="709"/>
-        <w:jc w:val="both"/>
-        <w:rPr>
-          <w:rFonts w:cs="Times New Roman"/>
-          <w:sz w:val="24"/>
-          <w:szCs w:val="24"/>
-        </w:rPr>
-      </w:pPr>
-      <w:r>
-        <w:rPr>
-          <w:rFonts w:cs="Times New Roman"/>
-          <w:sz w:val="24"/>
-          <w:szCs w:val="24"/>
-        </w:rPr>
-      </w:r>
-    </w:p>
-    <w:p>
-      <w:pPr>
         <w:pStyle w:val="Heading2"/>
         <w:rPr/>
       </w:pPr>
@@ -1817,49 +1953,36 @@
         </w:rPr>
         <w:t>В заключение, очакваният резултат не се изчерпва само с визуално завършен уеб сайт, а включва създаването на функционална, логически последователна и технически обоснована система, която показва умения за анализ, проектиране, реализация и документално описание на софтуерен продукт.</w:t>
       </w:r>
-      <w:bookmarkStart w:id="7" w:name="_Toc191746766"/>
-      <w:bookmarkStart w:id="8" w:name="_Toc191746765"/>
+    </w:p>
+    <w:p>
+      <w:pPr>
+        <w:pStyle w:val="Normal"/>
+        <w:spacing w:lineRule="auto" w:line="360" w:before="0" w:after="0"/>
+        <w:ind w:firstLine="709"/>
+        <w:jc w:val="both"/>
+        <w:rPr>
+          <w:rFonts w:cs="Times New Roman"/>
+          <w:sz w:val="24"/>
+          <w:szCs w:val="24"/>
+        </w:rPr>
+      </w:pPr>
+      <w:r>
+        <w:rPr>
+          <w:rFonts w:cs="Times New Roman"/>
+          <w:sz w:val="24"/>
+          <w:szCs w:val="24"/>
+        </w:rPr>
+      </w:r>
+    </w:p>
+    <w:p>
+      <w:pPr>
+        <w:pStyle w:val="Heading1"/>
+        <w:rPr/>
+      </w:pPr>
+      <w:bookmarkStart w:id="7" w:name="__RefHeading___Toc1174_3808462378"/>
       <w:bookmarkEnd w:id="7"/>
-      <w:bookmarkEnd w:id="8"/>
-      <w:r>
-        <w:br w:type="page"/>
-      </w:r>
-    </w:p>
-    <w:p>
-      <w:pPr>
-        <w:pStyle w:val="Normal"/>
-        <w:spacing w:lineRule="auto" w:line="360" w:before="0" w:after="0"/>
-        <w:ind w:firstLine="709"/>
-        <w:jc w:val="both"/>
-        <w:rPr>
-          <w:rFonts w:cs="Times New Roman"/>
-          <w:sz w:val="24"/>
-          <w:szCs w:val="24"/>
-        </w:rPr>
-      </w:pPr>
-      <w:r>
-        <w:rPr>
-          <w:rFonts w:cs="Times New Roman"/>
-          <w:sz w:val="24"/>
-          <w:szCs w:val="24"/>
-        </w:rPr>
-      </w:r>
-    </w:p>
-    <w:p>
-      <w:pPr>
-        <w:pStyle w:val="Heading1"/>
-        <w:rPr>
-          <w:sz w:val="32"/>
-          <w:szCs w:val="32"/>
-        </w:rPr>
-      </w:pPr>
-      <w:bookmarkStart w:id="9" w:name="__RefHeading___Toc868_3859341482"/>
-      <w:bookmarkEnd w:id="9"/>
-      <w:r>
-        <w:rPr>
-          <w:sz w:val="32"/>
-          <w:szCs w:val="32"/>
-        </w:rPr>
+      <w:r>
+        <w:rPr/>
         <w:t>2. ОСНОВНА ЧАСТ</w:t>
       </w:r>
     </w:p>
@@ -1891,8 +2014,8 @@
         <w:pStyle w:val="Heading2"/>
         <w:rPr/>
       </w:pPr>
-      <w:bookmarkStart w:id="10" w:name="__RefHeading___Toc870_3859341482"/>
-      <w:bookmarkEnd w:id="10"/>
+      <w:bookmarkStart w:id="8" w:name="__RefHeading___Toc870_3859341482"/>
+      <w:bookmarkEnd w:id="8"/>
       <w:r>
         <w:rPr/>
         <w:t>2.1. Избор на технологии</w:t>
@@ -2184,6 +2307,28 @@
           <w:lang w:val="bg-BG"/>
         </w:rPr>
         <w:t xml:space="preserve"> не трябва да се разглежда като списък от инструменти, а като основа, върху която стъпва цялостната работа на приложението.</w:t>
+      </w:r>
+    </w:p>
+    <w:p>
+      <w:pPr>
+        <w:pStyle w:val="Normal"/>
+        <w:spacing w:lineRule="auto" w:line="360" w:before="0" w:after="120"/>
+        <w:ind w:firstLine="709"/>
+        <w:jc w:val="both"/>
+        <w:rPr>
+          <w:rFonts w:ascii="Times New Roman" w:hAnsi="Times New Roman" w:cs="Times New Roman"/>
+          <w:sz w:val="24"/>
+          <w:szCs w:val="24"/>
+          <w:lang w:val="bg-BG"/>
+        </w:rPr>
+      </w:pPr>
+      <w:r>
+        <w:rPr>
+          <w:rFonts w:cs="Times New Roman"/>
+          <w:sz w:val="24"/>
+          <w:szCs w:val="24"/>
+          <w:lang w:val="bg-BG"/>
+        </w:rPr>
       </w:r>
     </w:p>
     <w:p>
@@ -2240,8 +2385,8 @@
         <w:ind w:hanging="0" w:start="0"/>
         <w:rPr/>
       </w:pPr>
-      <w:bookmarkStart w:id="11" w:name="__RefHeading___Toc872_3859341482"/>
-      <w:bookmarkEnd w:id="11"/>
+      <w:bookmarkStart w:id="9" w:name="__RefHeading___Toc872_3859341482"/>
+      <w:bookmarkEnd w:id="9"/>
       <w:r>
         <w:rPr/>
         <w:t>2.1.1. Избор на програмен език</w:t>
@@ -2678,16 +2823,6 @@
         </w:rPr>
         <w:t xml:space="preserve">Изборът на тези клиентски технологии има и образователна стойност. Чрез HTML, CSS и JavaScript се демонстрират фундаментални знания за работа с уеб страници, оформление и взаимодействие с потребителя. Вместо да се разчита изцяло на готови абстракции, разработката показва как реално се изграждат основните елементи на един сайт и как те комуникират със сървърния слой. </w:t>
       </w:r>
-      <w:r>
-        <w:rPr>
-          <w:rFonts w:cs="Times New Roman"/>
-          <w:sz w:val="24"/>
-          <w:szCs w:val="24"/>
-          <w:shd w:fill="FFFF00" w:val="clear"/>
-          <w:lang w:val="bg-BG"/>
-        </w:rPr>
-        <w:t>Това е важно за дипломна работа, защото показва не само умение да се използват готови инструменти, а и разбиране на базовите принципи на уеб разработката.</w:t>
-      </w:r>
     </w:p>
     <w:p>
       <w:pPr>
@@ -2733,28 +2868,6 @@
           <w:lang w:val="bg-BG"/>
         </w:rPr>
         <w:t xml:space="preserve"> това е баланс между функционалност, техническа яснота и реалистичен обхват на разработката.</w:t>
-      </w:r>
-    </w:p>
-    <w:p>
-      <w:pPr>
-        <w:pStyle w:val="Normal"/>
-        <w:spacing w:lineRule="auto" w:line="360" w:before="0" w:after="120"/>
-        <w:ind w:firstLine="709"/>
-        <w:jc w:val="both"/>
-        <w:rPr>
-          <w:rFonts w:ascii="Times New Roman" w:hAnsi="Times New Roman" w:cs="Times New Roman"/>
-          <w:sz w:val="24"/>
-          <w:szCs w:val="24"/>
-          <w:lang w:val="bg-BG"/>
-        </w:rPr>
-      </w:pPr>
-      <w:r>
-        <w:rPr>
-          <w:rFonts w:cs="Times New Roman"/>
-          <w:sz w:val="24"/>
-          <w:szCs w:val="24"/>
-          <w:lang w:val="bg-BG"/>
-        </w:rPr>
       </w:r>
     </w:p>
     <w:p>
@@ -2789,8 +2902,8 @@
         <w:ind w:hanging="0" w:start="0"/>
         <w:rPr/>
       </w:pPr>
-      <w:bookmarkStart w:id="12" w:name="__RefHeading___Toc874_3859341482"/>
-      <w:bookmarkEnd w:id="12"/>
+      <w:bookmarkStart w:id="10" w:name="__RefHeading___Toc874_3859341482"/>
+      <w:bookmarkEnd w:id="10"/>
       <w:r>
         <w:rPr/>
         <w:t>2.1.2. Избор на технология за сървъра</w:t>
@@ -3336,8 +3449,8 @@
         <w:ind w:hanging="0" w:start="0"/>
         <w:rPr/>
       </w:pPr>
-      <w:bookmarkStart w:id="13" w:name="__RefHeading___Toc876_3859341482"/>
-      <w:bookmarkEnd w:id="13"/>
+      <w:bookmarkStart w:id="11" w:name="__RefHeading___Toc876_3859341482"/>
+      <w:bookmarkEnd w:id="11"/>
       <w:r>
         <w:rPr/>
         <w:t>2.1.3. Избор на технология за базата данни</w:t>
@@ -3370,6 +3483,7 @@
           <w:rFonts w:cs="Times New Roman"/>
           <w:sz w:val="24"/>
           <w:szCs w:val="24"/>
+          <w:shd w:fill="auto" w:val="clear"/>
           <w:lang w:val="bg-BG"/>
         </w:rPr>
         <w:t xml:space="preserve">За съхранение и управление на данните в </w:t>
@@ -3384,6 +3498,7 @@
           <w:sz w:val="24"/>
           <w:szCs w:val="24"/>
           <w:u w:val="single"/>
+          <w:shd w:fill="auto" w:val="clear"/>
           <w:lang w:val="bg-BG"/>
         </w:rPr>
         <w:t>MusicShop</w:t>
@@ -3393,28 +3508,19 @@
           <w:rFonts w:cs="Times New Roman"/>
           <w:sz w:val="24"/>
           <w:szCs w:val="24"/>
-          <w:lang w:val="bg-BG"/>
-        </w:rPr>
-        <w:t xml:space="preserve"> е избрана релационната система </w:t>
-      </w:r>
-      <w:r>
-        <w:rPr>
-          <w:rFonts w:cs="Times New Roman"/>
-          <w:sz w:val="24"/>
-          <w:szCs w:val="24"/>
-          <w:shd w:fill="FFFF00" w:val="clear"/>
-          <w:lang w:val="bg-BG"/>
-        </w:rPr>
-        <w:t>MariaDB/MySQL</w:t>
-      </w:r>
-      <w:r>
-        <w:rPr>
-          <w:rFonts w:cs="Times New Roman"/>
-          <w:sz w:val="24"/>
-          <w:szCs w:val="24"/>
-          <w:lang w:val="bg-BG"/>
-        </w:rPr>
-        <w:t>. Това решение е пряко свързано с естеството на информацията, която приложението обработва. Онлайн магазинът работи с ясно дефинирани и взаимно свързани обекти: потребители, продукти, любими артикули, поръчки, редове към поръчки и новини. Тези данни имат стабилни зависимости и изискват надеждна структура, което прави релационния модел най-подходящ избор.</w:t>
+          <w:shd w:fill="auto" w:val="clear"/>
+          <w:lang w:val="bg-BG"/>
+        </w:rPr>
+        <w:t xml:space="preserve"> е избрана релационната система MariaDB/MySQL.</w:t>
+      </w:r>
+      <w:r>
+        <w:rPr>
+          <w:rFonts w:cs="Times New Roman"/>
+          <w:sz w:val="24"/>
+          <w:szCs w:val="24"/>
+          <w:lang w:val="bg-BG"/>
+        </w:rPr>
+        <w:t xml:space="preserve"> Това решение е пряко свързано с естеството на информацията, която приложението обработва. Онлайн магазинът работи с ясно дефинирани и взаимно свързани обекти: потребители, продукти, любими артикули, поръчки, редове към поръчки и новини. Тези данни имат стабилни зависимости и изискват надеждна структура, което прави релационния модел най-подходящ избор.</w:t>
       </w:r>
     </w:p>
     <w:p>
@@ -4098,40 +4204,39 @@
         </w:rPr>
         <w:t xml:space="preserve"> това решение осигурява стабилна и надеждна основа, върху която останалите модули на системата могат да функционират коректно. Релационната база данни не е просто място за съхранение, а важен компонент от цялостната архитектура на приложението.</w:t>
       </w:r>
-      <w:r>
-        <w:br w:type="page"/>
+    </w:p>
+    <w:p>
+      <w:pPr>
+        <w:pStyle w:val="Normal"/>
+        <w:spacing w:lineRule="auto" w:line="360" w:before="0" w:after="120"/>
+        <w:ind w:hanging="0" w:start="0"/>
+        <w:jc w:val="both"/>
+        <w:rPr>
+          <w:rFonts w:ascii="Times New Roman" w:hAnsi="Times New Roman" w:cs="Times New Roman"/>
+          <w:sz w:val="24"/>
+          <w:szCs w:val="24"/>
+          <w:lang w:val="bg-BG"/>
+        </w:rPr>
+      </w:pPr>
+      <w:r>
+        <w:rPr>
+          <w:rFonts w:cs="Times New Roman"/>
+          <w:sz w:val="24"/>
+          <w:szCs w:val="24"/>
+          <w:lang w:val="bg-BG"/>
+        </w:rPr>
       </w:r>
     </w:p>
     <w:p>
       <w:pPr>
         <w:pStyle w:val="Heading2"/>
-        <w:spacing w:before="0" w:after="0"/>
-        <w:rPr/>
-      </w:pPr>
-      <w:r>
-        <w:rPr/>
-      </w:r>
-    </w:p>
-    <w:p>
-      <w:pPr>
-        <w:pStyle w:val="Heading2"/>
-        <w:spacing w:before="0" w:after="0"/>
-        <w:rPr/>
-      </w:pPr>
-      <w:bookmarkStart w:id="14" w:name="__RefHeading___Toc878_3859341482"/>
-      <w:bookmarkEnd w:id="14"/>
+        <w:rPr/>
+      </w:pPr>
+      <w:bookmarkStart w:id="12" w:name="__RefHeading___Toc1176_3808462378"/>
+      <w:bookmarkEnd w:id="12"/>
       <w:r>
         <w:rPr/>
         <w:t>2.2. Софтуерен дизайн</w:t>
-      </w:r>
-    </w:p>
-    <w:p>
-      <w:pPr>
-        <w:pStyle w:val="Normal"/>
-        <w:rPr/>
-      </w:pPr>
-      <w:r>
-        <w:rPr/>
       </w:r>
     </w:p>
     <w:p>
@@ -4153,8 +4258,8 @@
         <w:ind w:hanging="0" w:start="0"/>
         <w:rPr/>
       </w:pPr>
-      <w:bookmarkStart w:id="15" w:name="__RefHeading___Toc880_3859341482"/>
-      <w:bookmarkEnd w:id="15"/>
+      <w:bookmarkStart w:id="13" w:name="__RefHeading___Toc880_3859341482"/>
+      <w:bookmarkEnd w:id="13"/>
       <w:r>
         <w:rPr/>
         <w:t>2.2.1. Етапи на разработка</w:t>
@@ -4254,6 +4359,28 @@
           <w:lang w:val="bg-BG"/>
         </w:rPr>
         <w:t xml:space="preserve"> тези етапи могат да бъдат обобщени в седем основни стъпки: събиране на информация и определяне на целите, планиране, дизайн на уеб приложението, кодиране и програмиране, оформяне на съдържанието и интерфейсните етикети, тестване и преглед, както и поддръжка и бъдещи актуализации. Тази структура следва логиката на реалната разработка и е подходяща за описване на проекта в дипломната документация.</w:t>
+      </w:r>
+    </w:p>
+    <w:p>
+      <w:pPr>
+        <w:pStyle w:val="Normal"/>
+        <w:spacing w:lineRule="auto" w:line="360" w:before="0" w:after="120"/>
+        <w:ind w:firstLine="709"/>
+        <w:jc w:val="both"/>
+        <w:rPr>
+          <w:rFonts w:ascii="Times New Roman" w:hAnsi="Times New Roman" w:cs="Times New Roman"/>
+          <w:sz w:val="24"/>
+          <w:szCs w:val="24"/>
+          <w:lang w:val="bg-BG"/>
+        </w:rPr>
+      </w:pPr>
+      <w:r>
+        <w:rPr>
+          <w:rFonts w:cs="Times New Roman"/>
+          <w:sz w:val="24"/>
+          <w:szCs w:val="24"/>
+          <w:lang w:val="bg-BG"/>
+        </w:rPr>
       </w:r>
     </w:p>
     <w:p>
@@ -4452,7 +4579,51 @@
       <w:pPr>
         <w:pStyle w:val="Normal"/>
         <w:spacing w:lineRule="auto" w:line="360" w:before="0" w:after="120"/>
-        <w:ind w:firstLine="709"/>
+        <w:ind w:hanging="0" w:start="0"/>
+        <w:jc w:val="both"/>
+        <w:rPr>
+          <w:rFonts w:ascii="Times New Roman" w:hAnsi="Times New Roman" w:cs="Times New Roman"/>
+          <w:sz w:val="24"/>
+          <w:szCs w:val="24"/>
+          <w:lang w:val="bg-BG"/>
+        </w:rPr>
+      </w:pPr>
+      <w:r>
+        <w:rPr>
+          <w:rFonts w:cs="Times New Roman"/>
+          <w:sz w:val="24"/>
+          <w:szCs w:val="24"/>
+          <w:lang w:val="bg-BG"/>
+        </w:rPr>
+      </w:r>
+    </w:p>
+    <w:p>
+      <w:pPr>
+        <w:pStyle w:val="Normal"/>
+        <w:spacing w:lineRule="auto" w:line="360" w:before="0" w:after="120"/>
+        <w:ind w:hanging="0" w:start="0"/>
+        <w:jc w:val="both"/>
+        <w:rPr>
+          <w:rFonts w:ascii="Times New Roman" w:hAnsi="Times New Roman" w:cs="Times New Roman"/>
+          <w:sz w:val="24"/>
+          <w:szCs w:val="24"/>
+          <w:lang w:val="bg-BG"/>
+        </w:rPr>
+      </w:pPr>
+      <w:r>
+        <w:rPr>
+          <w:rFonts w:cs="Times New Roman"/>
+          <w:sz w:val="24"/>
+          <w:szCs w:val="24"/>
+          <w:lang w:val="bg-BG"/>
+        </w:rPr>
+      </w:r>
+    </w:p>
+    <w:p>
+      <w:pPr>
+        <w:pStyle w:val="Normal"/>
+        <w:spacing w:lineRule="auto" w:line="360" w:before="0" w:after="120"/>
+        <w:ind w:hanging="0" w:start="0"/>
         <w:jc w:val="both"/>
         <w:rPr>
           <w:rFonts w:ascii="Times New Roman" w:hAnsi="Times New Roman" w:cs="Times New Roman"/>
@@ -4638,6 +4809,50 @@
           <w:lang w:val="bg-BG"/>
         </w:rPr>
         <w:t xml:space="preserve"> е избрано многoстранично уеб приложение, в което HTML страниците се зареждат отделно, а динамичните данни се извличат чрез асинхронни заявки към PHP API крайни точки. Това решение е важно още на етап планиране, защото влияе както върху клиентската логика, така и върху дизайна на сървърните файлове и върху начина на работа с базата данни.</w:t>
+      </w:r>
+    </w:p>
+    <w:p>
+      <w:pPr>
+        <w:pStyle w:val="Normal"/>
+        <w:spacing w:lineRule="auto" w:line="360" w:before="0" w:after="120"/>
+        <w:ind w:firstLine="709"/>
+        <w:jc w:val="both"/>
+        <w:rPr>
+          <w:rFonts w:ascii="Times New Roman" w:hAnsi="Times New Roman" w:cs="Times New Roman"/>
+          <w:sz w:val="24"/>
+          <w:szCs w:val="24"/>
+          <w:lang w:val="bg-BG"/>
+        </w:rPr>
+      </w:pPr>
+      <w:r>
+        <w:rPr>
+          <w:rFonts w:cs="Times New Roman"/>
+          <w:sz w:val="24"/>
+          <w:szCs w:val="24"/>
+          <w:lang w:val="bg-BG"/>
+        </w:rPr>
+      </w:r>
+    </w:p>
+    <w:p>
+      <w:pPr>
+        <w:pStyle w:val="Normal"/>
+        <w:spacing w:lineRule="auto" w:line="360" w:before="0" w:after="120"/>
+        <w:ind w:firstLine="709"/>
+        <w:jc w:val="both"/>
+        <w:rPr>
+          <w:rFonts w:ascii="Times New Roman" w:hAnsi="Times New Roman" w:cs="Times New Roman"/>
+          <w:sz w:val="24"/>
+          <w:szCs w:val="24"/>
+          <w:lang w:val="bg-BG"/>
+        </w:rPr>
+      </w:pPr>
+      <w:r>
+        <w:rPr>
+          <w:rFonts w:cs="Times New Roman"/>
+          <w:sz w:val="24"/>
+          <w:szCs w:val="24"/>
+          <w:lang w:val="bg-BG"/>
+        </w:rPr>
       </w:r>
     </w:p>
     <w:p>
@@ -5215,28 +5430,6 @@
     <w:p>
       <w:pPr>
         <w:pStyle w:val="Normal"/>
-        <w:spacing w:lineRule="auto" w:line="360" w:before="0" w:after="120"/>
-        <w:ind w:firstLine="709"/>
-        <w:jc w:val="both"/>
-        <w:rPr>
-          <w:rFonts w:ascii="Times New Roman" w:hAnsi="Times New Roman" w:cs="Times New Roman"/>
-          <w:sz w:val="24"/>
-          <w:szCs w:val="24"/>
-          <w:lang w:val="bg-BG"/>
-        </w:rPr>
-      </w:pPr>
-      <w:r>
-        <w:rPr>
-          <w:rFonts w:cs="Times New Roman"/>
-          <w:sz w:val="24"/>
-          <w:szCs w:val="24"/>
-          <w:lang w:val="bg-BG"/>
-        </w:rPr>
-      </w:r>
-    </w:p>
-    <w:p>
-      <w:pPr>
-        <w:pStyle w:val="Normal"/>
         <w:spacing w:before="100" w:after="60"/>
         <w:jc w:val="start"/>
         <w:rPr>
@@ -5491,28 +5684,6 @@
     <w:p>
       <w:pPr>
         <w:pStyle w:val="Normal"/>
-        <w:spacing w:lineRule="auto" w:line="360" w:before="0" w:after="120"/>
-        <w:ind w:firstLine="709"/>
-        <w:jc w:val="both"/>
-        <w:rPr>
-          <w:rFonts w:ascii="Times New Roman" w:hAnsi="Times New Roman" w:cs="Times New Roman"/>
-          <w:sz w:val="24"/>
-          <w:szCs w:val="24"/>
-          <w:lang w:val="bg-BG"/>
-        </w:rPr>
-      </w:pPr>
-      <w:r>
-        <w:rPr>
-          <w:rFonts w:cs="Times New Roman"/>
-          <w:sz w:val="24"/>
-          <w:szCs w:val="24"/>
-          <w:lang w:val="bg-BG"/>
-        </w:rPr>
-      </w:r>
-    </w:p>
-    <w:p>
-      <w:pPr>
-        <w:pStyle w:val="Normal"/>
         <w:spacing w:before="100" w:after="60"/>
         <w:jc w:val="start"/>
         <w:rPr>
@@ -5705,28 +5876,6 @@
     <w:p>
       <w:pPr>
         <w:pStyle w:val="Normal"/>
-        <w:spacing w:lineRule="auto" w:line="360" w:before="0" w:after="120"/>
-        <w:ind w:firstLine="709"/>
-        <w:jc w:val="both"/>
-        <w:rPr>
-          <w:rFonts w:ascii="Times New Roman" w:hAnsi="Times New Roman" w:cs="Times New Roman"/>
-          <w:sz w:val="24"/>
-          <w:szCs w:val="24"/>
-          <w:lang w:val="bg-BG"/>
-        </w:rPr>
-      </w:pPr>
-      <w:r>
-        <w:rPr>
-          <w:rFonts w:cs="Times New Roman"/>
-          <w:sz w:val="24"/>
-          <w:szCs w:val="24"/>
-          <w:lang w:val="bg-BG"/>
-        </w:rPr>
-      </w:r>
-    </w:p>
-    <w:p>
-      <w:pPr>
-        <w:pStyle w:val="Normal"/>
         <w:spacing w:before="100" w:after="60"/>
         <w:jc w:val="start"/>
         <w:rPr>
@@ -5910,27 +6059,6 @@
           <w:lang w:val="bg-BG"/>
         </w:rPr>
         <w:t xml:space="preserve"> показват подреден и аргументиран процес, започващ от анализ на идеята и достигащ до поддръжка и възможности за развитие. Всеки етап има своя принос към крайния резултат и заедно те формират цялостната рамка, в която проектът е реализиран. Именно тази последователност е една от причините приложението да бъде не просто набор от страници и файлове, а завършена уеб система с ясна логика и практическа стойност.</w:t>
-      </w:r>
-    </w:p>
-    <w:p>
-      <w:pPr>
-        <w:pStyle w:val="Normal"/>
-        <w:rPr>
-          <w:rFonts w:ascii="Times New Roman" w:hAnsi="Times New Roman" w:cs="Times New Roman"/>
-          <w:b/>
-          <w:sz w:val="28"/>
-          <w:szCs w:val="28"/>
-          <w:lang w:val="bg-BG"/>
-        </w:rPr>
-      </w:pPr>
-      <w:r>
-        <w:rPr>
-          <w:rFonts w:cs="Times New Roman"/>
-          <w:b/>
-          <w:sz w:val="28"/>
-          <w:szCs w:val="28"/>
-          <w:lang w:val="bg-BG"/>
-        </w:rPr>
       </w:r>
     </w:p>
     <w:p>
@@ -5964,8 +6092,8 @@
         <w:ind w:hanging="0" w:start="0"/>
         <w:rPr/>
       </w:pPr>
-      <w:bookmarkStart w:id="16" w:name="__RefHeading___Toc882_3859341482"/>
-      <w:bookmarkEnd w:id="16"/>
+      <w:bookmarkStart w:id="14" w:name="__RefHeading___Toc882_3859341482"/>
+      <w:bookmarkEnd w:id="14"/>
       <w:r>
         <w:rPr/>
         <w:t>2.2.2. Софтуерна архитектура</w:t>
@@ -6947,8 +7075,8 @@
         <w:ind w:hanging="0" w:start="0"/>
         <w:rPr/>
       </w:pPr>
-      <w:bookmarkStart w:id="17" w:name="__RefHeading___Toc884_3859341482"/>
-      <w:bookmarkEnd w:id="17"/>
+      <w:bookmarkStart w:id="15" w:name="__RefHeading___Toc884_3859341482"/>
+      <w:bookmarkEnd w:id="15"/>
       <w:r>
         <w:rPr/>
         <w:t>2.2.3. Описание и взаимодействие с приложението</w:t>
@@ -7028,7 +7156,12 @@
         <w:spacing w:lineRule="auto" w:line="360" w:before="0" w:after="120"/>
         <w:ind w:firstLine="709"/>
         <w:jc w:val="both"/>
-        <w:rPr/>
+        <w:rPr>
+          <w:rFonts w:cs="Times New Roman"/>
+          <w:sz w:val="24"/>
+          <w:szCs w:val="24"/>
+          <w:lang w:val="bg-BG"/>
+        </w:rPr>
       </w:pPr>
       <w:r>
         <w:rPr>
@@ -7044,22 +7177,18 @@
       <w:pPr>
         <w:pStyle w:val="Normal"/>
         <w:spacing w:lineRule="auto" w:line="360" w:before="0" w:after="120"/>
-        <w:ind w:hanging="0" w:start="0"/>
-        <w:jc w:val="both"/>
-        <w:rPr>
-          <w:rFonts w:cs="Times New Roman"/>
-          <w:b/>
-          <w:bCs/>
-          <w:sz w:val="24"/>
-          <w:szCs w:val="24"/>
-          <w:lang w:val="bg-BG"/>
-        </w:rPr>
-      </w:pPr>
-      <w:r>
-        <w:rPr>
-          <w:rFonts w:cs="Times New Roman"/>
-          <w:b/>
-          <w:bCs/>
+        <w:ind w:firstLine="709"/>
+        <w:jc w:val="both"/>
+        <w:rPr>
+          <w:rFonts w:cs="Times New Roman"/>
+          <w:sz w:val="24"/>
+          <w:szCs w:val="24"/>
+          <w:lang w:val="bg-BG"/>
+        </w:rPr>
+      </w:pPr>
+      <w:r>
+        <w:rPr>
+          <w:rFonts w:cs="Times New Roman"/>
           <w:sz w:val="24"/>
           <w:szCs w:val="24"/>
           <w:lang w:val="bg-BG"/>
@@ -7090,43 +7219,16 @@
           <w:szCs w:val="24"/>
           <w:lang w:val="bg-BG"/>
         </w:rPr>
-        <w:t>DATA FLOW ДИАГРАМА</w:t>
-      </w:r>
-    </w:p>
-    <w:p>
-      <w:pPr>
-        <w:pStyle w:val="Normal"/>
-        <w:spacing w:lineRule="auto" w:line="360" w:before="0" w:after="120"/>
-        <w:ind w:hanging="0" w:start="0"/>
-        <w:jc w:val="center"/>
-        <w:rPr>
-          <w:rFonts w:cs="Times New Roman"/>
-          <w:b/>
-          <w:bCs/>
-          <w:sz w:val="24"/>
-          <w:szCs w:val="24"/>
-          <w:lang w:val="bg-BG"/>
-        </w:rPr>
-      </w:pPr>
-      <w:r>
-        <w:rPr>
-          <w:rFonts w:cs="Times New Roman"/>
-          <w:b/>
-          <w:bCs/>
-          <w:sz w:val="24"/>
-          <w:szCs w:val="24"/>
-          <w:lang w:val="bg-BG"/>
-        </w:rPr>
         <w:drawing>
-          <wp:anchor distT="0" distB="0" distL="0" distR="0" simplePos="0" relativeHeight="2" behindDoc="0" locked="0" layoutInCell="0" allowOverlap="1">
+          <wp:anchor distT="0" distB="0" distL="0" distR="0" simplePos="0" relativeHeight="13" behindDoc="0" locked="0" layoutInCell="0" allowOverlap="1">
             <wp:simplePos x="0" y="0"/>
             <wp:positionH relativeFrom="column">
-              <wp:posOffset>545465</wp:posOffset>
+              <wp:posOffset>-662940</wp:posOffset>
             </wp:positionH>
             <wp:positionV relativeFrom="paragraph">
-              <wp:posOffset>-17780</wp:posOffset>
+              <wp:posOffset>322580</wp:posOffset>
             </wp:positionV>
-            <wp:extent cx="4744720" cy="5655945"/>
+            <wp:extent cx="7075170" cy="2175510"/>
             <wp:effectExtent l="0" t="0" r="0" b="0"/>
             <wp:wrapSquare wrapText="largest"/>
             <wp:docPr id="1" name="Image1"/>
@@ -7151,7 +7253,7 @@
                   <pic:spPr bwMode="auto">
                     <a:xfrm>
                       <a:off x="0" y="0"/>
-                      <a:ext cx="4744720" cy="5655945"/>
+                      <a:ext cx="7075170" cy="2175510"/>
                     </a:xfrm>
                     <a:prstGeom prst="rect">
                       <a:avLst/>
@@ -7164,6 +7266,20 @@
           </wp:anchor>
         </w:drawing>
       </w:r>
+      <w:r>
+        <w:rPr>
+          <w:rFonts w:cs="Times New Roman"/>
+          <w:b/>
+          <w:bCs/>
+          <w:sz w:val="24"/>
+          <w:szCs w:val="24"/>
+          <w:lang w:val="bg-BG"/>
+        </w:rPr>
+        <w:t>FLOWCHART ДИАГРАМA</w:t>
+      </w:r>
+      <w:r>
+        <w:br w:type="page"/>
+      </w:r>
     </w:p>
     <w:p>
       <w:pPr>
@@ -7185,32 +7301,6 @@
           <w:szCs w:val="24"/>
           <w:lang w:val="bg-BG"/>
         </w:rPr>
-        <w:tab/>
-      </w:r>
-      <w:r>
-        <w:br w:type="page"/>
-      </w:r>
-    </w:p>
-    <w:p>
-      <w:pPr>
-        <w:pStyle w:val="Normal"/>
-        <w:spacing w:lineRule="auto" w:line="360" w:before="0" w:after="120"/>
-        <w:ind w:hanging="0" w:start="0"/>
-        <w:jc w:val="both"/>
-        <w:rPr>
-          <w:rFonts w:cs="Times New Roman"/>
-          <w:sz w:val="24"/>
-          <w:szCs w:val="24"/>
-          <w:lang w:val="bg-BG"/>
-        </w:rPr>
-      </w:pPr>
-      <w:r>
-        <w:rPr>
-          <w:rFonts w:cs="Times New Roman"/>
-          <w:sz w:val="24"/>
-          <w:szCs w:val="24"/>
-          <w:lang w:val="bg-BG"/>
-        </w:rPr>
         <w:t xml:space="preserve">Администраторът взаимодейства с приложението по различен начин. След вход с администраторска роля той получава достъп до административния панел, в който може да добавя, редактира и изтрива продукти, да управлява новини и да преглежда всички постъпили поръчки. Така системата не е ограничена само до клиентска функционалност, а предоставя и вътрешен модул за поддръжка на съдържанието. Това е особено важно за проекта, защото показва, че </w:t>
       </w:r>
       <w:r>
@@ -7276,38 +7366,6 @@
           <w:lang w:val="bg-BG"/>
         </w:rPr>
         <w:t xml:space="preserve"> предлага ясно, подредено и лесно проследимо взаимодействие между различните потребители и отделните функционалности на системата.</w:t>
-      </w:r>
-    </w:p>
-    <w:p>
-      <w:pPr>
-        <w:pStyle w:val="Normal"/>
-        <w:rPr/>
-      </w:pPr>
-      <w:r>
-        <w:rPr/>
-      </w:r>
-    </w:p>
-    <w:p>
-      <w:pPr>
-        <w:pStyle w:val="Normal"/>
-        <w:spacing w:before="120" w:after="120"/>
-        <w:jc w:val="center"/>
-        <w:rPr>
-          <w:rFonts w:ascii="Times New Roman" w:hAnsi="Times New Roman" w:cs="Times New Roman"/>
-          <w:b/>
-          <w:sz w:val="28"/>
-          <w:szCs w:val="28"/>
-          <w:lang w:val="bg-BG"/>
-        </w:rPr>
-      </w:pPr>
-      <w:r>
-        <w:rPr>
-          <w:rFonts w:cs="Times New Roman"/>
-          <w:b/>
-          <w:sz w:val="28"/>
-          <w:szCs w:val="28"/>
-          <w:lang w:val="bg-BG"/>
-        </w:rPr>
       </w:r>
     </w:p>
     <w:p>
@@ -7343,8 +7401,8 @@
         <w:ind w:hanging="0" w:start="0"/>
         <w:rPr/>
       </w:pPr>
-      <w:bookmarkStart w:id="18" w:name="__RefHeading___Toc886_3859341482"/>
-      <w:bookmarkEnd w:id="18"/>
+      <w:bookmarkStart w:id="16" w:name="__RefHeading___Toc886_3859341482"/>
+      <w:bookmarkEnd w:id="16"/>
       <w:r>
         <w:rPr/>
         <w:t>2.2.4. Графичен дизайн и структура на приложението</w:t>
@@ -8302,27 +8360,6 @@
           <w:lang w:val="bg-BG"/>
         </w:rPr>
         <w:t xml:space="preserve"> са подчинени на една основна цел: да осигурят ясно, последователно и удобно потребителско изживяване. Всяка страница има конкретна роля в общата логика на приложението, а повторението на общи визуални елементи създава усещане за завършен продукт. Това прави системата не само функционална, но и добре организирана от гледна точка на потребителския интерфейс и цялостната структура на приложението.</w:t>
-      </w:r>
-    </w:p>
-    <w:p>
-      <w:pPr>
-        <w:pStyle w:val="Normal"/>
-        <w:rPr>
-          <w:rFonts w:ascii="Times New Roman" w:hAnsi="Times New Roman" w:cs="Times New Roman"/>
-          <w:b/>
-          <w:sz w:val="28"/>
-          <w:szCs w:val="28"/>
-          <w:lang w:val="bg-BG"/>
-        </w:rPr>
-      </w:pPr>
-      <w:r>
-        <w:rPr>
-          <w:rFonts w:cs="Times New Roman"/>
-          <w:b/>
-          <w:sz w:val="28"/>
-          <w:szCs w:val="28"/>
-          <w:lang w:val="bg-BG"/>
-        </w:rPr>
       </w:r>
     </w:p>
     <w:p>
@@ -8356,8 +8393,8 @@
         <w:ind w:hanging="0" w:start="0"/>
         <w:rPr/>
       </w:pPr>
-      <w:bookmarkStart w:id="19" w:name="__RefHeading___Toc888_3859341482"/>
-      <w:bookmarkEnd w:id="19"/>
+      <w:bookmarkStart w:id="17" w:name="__RefHeading___Toc888_3859341482"/>
+      <w:bookmarkEnd w:id="17"/>
       <w:r>
         <w:rPr/>
         <w:t>2.2.5. Дизайн на сървъра</w:t>
@@ -8980,15 +9017,6 @@
           <w:lang w:val="bg-BG"/>
         </w:rPr>
         <w:t xml:space="preserve"> е проектиран като лек, модулен и достатъчно сигурен слой, който обслужва както потребителските, така и административните операции в системата. Използването на отделни API крайни точки, централизирана връзка с базата данни, PHP сесии и допълнителни проверки за достъп правят сървърната част добре организирана и подходяща за проекта. Именно този дизайн позволява приложението да работи надеждно и да поддържа всички основни функционалности на онлайн магазина.</w:t>
-      </w:r>
-    </w:p>
-    <w:p>
-      <w:pPr>
-        <w:pStyle w:val="Normal"/>
-        <w:rPr/>
-      </w:pPr>
-      <w:r>
-        <w:rPr/>
       </w:r>
     </w:p>
     <w:p>
@@ -9010,6 +9038,8 @@
         <w:ind w:hanging="0" w:start="0"/>
         <w:rPr/>
       </w:pPr>
+      <w:bookmarkStart w:id="18" w:name="__RefHeading___Toc1178_3808462378"/>
+      <w:bookmarkEnd w:id="18"/>
       <w:r>
         <w:rPr/>
         <w:t>2.2.6. Дизайн на базата данни</w:t>
@@ -9910,25 +9940,7 @@
           <w:szCs w:val="24"/>
           <w:lang w:val="bg-BG"/>
         </w:rPr>
-        <w:t>, което означава, че при изтриване на потребител или продукт съответните записи в</w:t>
-      </w:r>
-      <w:r>
-        <w:rPr>
-          <w:rFonts w:cs="Times New Roman"/>
-          <w:sz w:val="24"/>
-          <w:szCs w:val="24"/>
-          <w:lang w:val="bg-BG"/>
-        </w:rPr>
-        <w:t>ъв</w:t>
-      </w:r>
-      <w:r>
-        <w:rPr>
-          <w:rFonts w:cs="Times New Roman"/>
-          <w:sz w:val="24"/>
-          <w:szCs w:val="24"/>
-          <w:lang w:val="bg-BG"/>
-        </w:rPr>
-        <w:t xml:space="preserve"> </w:t>
+        <w:t xml:space="preserve">, което означава, че при изтриване на потребител или продукт съответните записи във </w:t>
       </w:r>
       <w:r>
         <w:rPr>
@@ -10514,18 +10526,7 @@
           <w:szCs w:val="24"/>
           <w:lang w:val="bg-BG"/>
         </w:rPr>
-        <w:t>im</w:t>
-      </w:r>
-      <w:r>
-        <w:rPr>
-          <w:rFonts w:cs="Times New Roman"/>
-          <w:i/>
-          <w:iCs/>
-          <w:sz w:val="24"/>
-          <w:szCs w:val="24"/>
-          <w:lang w:val="bg-BG"/>
-        </w:rPr>
-        <w:t>age_url</w:t>
+        <w:t>image_url</w:t>
       </w:r>
       <w:r>
         <w:rPr>
@@ -10922,6 +10923,29 @@
           <w:lang w:val="bg-BG"/>
         </w:rPr>
         <w:t xml:space="preserve"> заявки, без да се губи логическата връзка между потребител, продукт и поръчка. Подобен модел е едновременно ясен и достатъчно практичен за реалната функционалност на системата.</w:t>
+      </w:r>
+    </w:p>
+    <w:p>
+      <w:pPr>
+        <w:pStyle w:val="Normal"/>
+        <w:spacing w:before="100" w:after="60"/>
+        <w:jc w:val="start"/>
+        <w:rPr>
+          <w:rFonts w:ascii="Times New Roman" w:hAnsi="Times New Roman" w:cs="Times New Roman"/>
+          <w:b/>
+          <w:sz w:val="24"/>
+          <w:szCs w:val="24"/>
+          <w:lang w:val="bg-BG"/>
+        </w:rPr>
+      </w:pPr>
+      <w:r>
+        <w:rPr>
+          <w:rFonts w:cs="Times New Roman"/>
+          <w:b/>
+          <w:sz w:val="24"/>
+          <w:szCs w:val="24"/>
+          <w:lang w:val="bg-BG"/>
+        </w:rPr>
       </w:r>
     </w:p>
     <w:p>
@@ -11115,20 +11139,7 @@
           <w:szCs w:val="24"/>
           <w:lang w:val="bg-BG"/>
         </w:rPr>
-        <w:t xml:space="preserve"> </w:t>
-      </w:r>
-      <w:r>
-        <w:rPr>
-          <w:rFonts w:cs="Times New Roman"/>
-          <w:b w:val="false"/>
-          <w:bCs w:val="false"/>
-          <w:i w:val="false"/>
-          <w:iCs w:val="false"/>
-          <w:sz w:val="24"/>
-          <w:szCs w:val="24"/>
-          <w:lang w:val="bg-BG"/>
-        </w:rPr>
-        <w:t xml:space="preserve">и </w:t>
+        <w:t xml:space="preserve"> и </w:t>
       </w:r>
       <w:r>
         <w:rPr>
@@ -11177,45 +11188,12 @@
     </w:p>
     <w:p>
       <w:pPr>
-        <w:pStyle w:val="Normal"/>
-        <w:rPr/>
-      </w:pPr>
-      <w:r>
-        <w:rPr/>
-      </w:r>
-    </w:p>
-    <w:p>
-      <w:pPr>
-        <w:pStyle w:val="Normal"/>
-        <w:rPr/>
-      </w:pPr>
-      <w:r>
-        <w:rPr/>
-      </w:r>
-    </w:p>
-    <w:p>
-      <w:pPr>
-        <w:pStyle w:val="Normal"/>
-        <w:rPr/>
-      </w:pPr>
-      <w:r>
-        <w:rPr/>
-      </w:r>
-    </w:p>
-    <w:p>
-      <w:pPr>
-        <w:pStyle w:val="Normal"/>
-        <w:rPr/>
-      </w:pPr>
-      <w:r>
-        <w:rPr/>
-      </w:r>
-    </w:p>
-    <w:p>
-      <w:pPr>
-        <w:pStyle w:val="Normal"/>
-        <w:spacing w:before="120" w:after="80"/>
-        <w:jc w:val="start"/>
+        <w:pStyle w:val="Heading3"/>
+        <w:numPr>
+          <w:ilvl w:val="2"/>
+          <w:numId w:val="1"/>
+        </w:numPr>
+        <w:ind w:hanging="0" w:start="0"/>
         <w:rPr>
           <w:rFonts w:cs="Times New Roman"/>
           <w:b/>
@@ -11224,14 +11202,10 @@
           <w:lang w:val="bg-BG"/>
         </w:rPr>
       </w:pPr>
-      <w:r>
-        <w:rPr>
-          <w:rFonts w:cs="Times New Roman"/>
-          <w:b/>
-          <w:sz w:val="26"/>
-          <w:szCs w:val="26"/>
-          <w:lang w:val="bg-BG"/>
-        </w:rPr>
+      <w:bookmarkStart w:id="19" w:name="__RefHeading___Toc1180_3808462378"/>
+      <w:bookmarkEnd w:id="19"/>
+      <w:r>
+        <w:rPr/>
         <w:t>2.2.7. CRUD заявки</w:t>
       </w:r>
     </w:p>
@@ -12540,15 +12514,6 @@
     <w:p>
       <w:pPr>
         <w:pStyle w:val="Normal"/>
-        <w:rPr/>
-      </w:pPr>
-      <w:r>
-        <w:rPr/>
-      </w:r>
-    </w:p>
-    <w:p>
-      <w:pPr>
-        <w:pStyle w:val="Normal"/>
         <w:spacing w:before="100" w:after="60"/>
         <w:jc w:val="start"/>
         <w:rPr/>
@@ -13141,33 +13106,6 @@
     <w:p>
       <w:pPr>
         <w:pStyle w:val="Normal"/>
-        <w:rPr/>
-      </w:pPr>
-      <w:r>
-        <w:rPr/>
-      </w:r>
-    </w:p>
-    <w:p>
-      <w:pPr>
-        <w:pStyle w:val="Normal"/>
-        <w:rPr/>
-      </w:pPr>
-      <w:r>
-        <w:rPr/>
-      </w:r>
-    </w:p>
-    <w:p>
-      <w:pPr>
-        <w:pStyle w:val="Normal"/>
-        <w:rPr/>
-      </w:pPr>
-      <w:r>
-        <w:rPr/>
-      </w:r>
-    </w:p>
-    <w:p>
-      <w:pPr>
-        <w:pStyle w:val="Normal"/>
         <w:spacing w:before="100" w:after="60"/>
         <w:jc w:val="start"/>
         <w:rPr/>
@@ -13761,24 +13699,6 @@
     <w:p>
       <w:pPr>
         <w:pStyle w:val="Normal"/>
-        <w:rPr/>
-      </w:pPr>
-      <w:r>
-        <w:rPr/>
-      </w:r>
-    </w:p>
-    <w:p>
-      <w:pPr>
-        <w:pStyle w:val="Normal"/>
-        <w:rPr/>
-      </w:pPr>
-      <w:r>
-        <w:rPr/>
-      </w:r>
-    </w:p>
-    <w:p>
-      <w:pPr>
-        <w:pStyle w:val="Normal"/>
         <w:spacing w:lineRule="auto" w:line="360" w:before="0" w:after="120"/>
         <w:ind w:firstLine="709"/>
         <w:jc w:val="both"/>
@@ -13862,15 +13782,12 @@
         </w:rPr>
         <w:t>. Чрез тях системата може да създава нови записи, да извлича съществуваща информация, да редактира данните при нужда и да премахва вече ненужни записи. Именно благодарение на тези операции приложението функционира не само като визуален уебсайт, а като реална уеб базирана система за управление на музикален магазин.</w:t>
       </w:r>
-      <w:r>
-        <w:br w:type="page"/>
-      </w:r>
-    </w:p>
-    <w:p>
-      <w:pPr>
-        <w:pStyle w:val="Normal"/>
-        <w:spacing w:lineRule="auto" w:line="360" w:before="0" w:after="120"/>
-        <w:ind w:firstLine="709"/>
+    </w:p>
+    <w:p>
+      <w:pPr>
+        <w:pStyle w:val="Normal"/>
+        <w:spacing w:lineRule="auto" w:line="360" w:before="0" w:after="120"/>
+        <w:ind w:hanging="0" w:start="0"/>
         <w:jc w:val="both"/>
         <w:rPr>
           <w:rFonts w:ascii="Times New Roman" w:hAnsi="Times New Roman" w:cs="Times New Roman"/>
@@ -13893,7 +13810,7 @@
         <w:pStyle w:val="Heading2"/>
         <w:rPr/>
       </w:pPr>
-      <w:bookmarkStart w:id="20" w:name="__RefHeading___Toc892_3859341482"/>
+      <w:bookmarkStart w:id="20" w:name="__RefHeading___Toc1182_3808462378"/>
       <w:bookmarkEnd w:id="20"/>
       <w:r>
         <w:rPr/>
@@ -14090,9 +14007,6 @@
         </w:rPr>
         <w:t xml:space="preserve"> изпълнява основните изисквания на проекта и функционира като завършено уеб приложение за музикален магазин. Системата осигурява коректна работа на основните клиентски и административни модули, поддържа връзка с базата данни и демонстрира надеждна логика при работа с продукти, потребители, любими, поръчки и новини.</w:t>
       </w:r>
-      <w:r>
-        <w:br w:type="page"/>
-      </w:r>
     </w:p>
     <w:p>
       <w:pPr>
@@ -14118,32 +14032,14 @@
     </w:p>
     <w:p>
       <w:pPr>
-        <w:pStyle w:val="Normal"/>
-        <w:rPr/>
-      </w:pPr>
-      <w:r>
-        <w:rPr/>
-      </w:r>
-    </w:p>
-    <w:p>
-      <w:pPr>
         <w:pStyle w:val="Heading1"/>
         <w:rPr/>
       </w:pPr>
-      <w:bookmarkStart w:id="21" w:name="__RefHeading___Toc894_3859341482"/>
+      <w:bookmarkStart w:id="21" w:name="__RefHeading___Toc1184_3808462378"/>
       <w:bookmarkEnd w:id="21"/>
       <w:r>
         <w:rPr/>
         <w:t>3. ЗАКЛЮЧЕНИЕ</w:t>
-      </w:r>
-    </w:p>
-    <w:p>
-      <w:pPr>
-        <w:pStyle w:val="Normal"/>
-        <w:rPr/>
-      </w:pPr>
-      <w:r>
-        <w:rPr/>
       </w:r>
     </w:p>
     <w:p>
@@ -14282,7 +14178,12 @@
         <w:spacing w:lineRule="auto" w:line="360" w:before="0" w:after="120"/>
         <w:ind w:firstLine="709"/>
         <w:jc w:val="both"/>
-        <w:rPr/>
+        <w:rPr>
+          <w:rFonts w:cs="Times New Roman"/>
+          <w:sz w:val="24"/>
+          <w:szCs w:val="24"/>
+          <w:lang w:val="bg-BG"/>
+        </w:rPr>
       </w:pPr>
       <w:r>
         <w:rPr>
@@ -14315,28 +14216,6 @@
           <w:lang w:val="bg-BG"/>
         </w:rPr>
         <w:t>Работата по проекта има и съществена учебна стойност, тъй като в нея са приложени знания и умения, свързани с уеб програмиране, моделиране на база данни, софтуерен дизайн, работа с потребителски интерфейс и проверка на функционалността на готовото приложение. Изпълнението на всички етапи от разработката показва способност за преминаване от първоначална идея към практически реализиран софтуерен продукт.</w:t>
-      </w:r>
-    </w:p>
-    <w:p>
-      <w:pPr>
-        <w:pStyle w:val="Normal"/>
-        <w:spacing w:lineRule="auto" w:line="360" w:before="0" w:after="120"/>
-        <w:ind w:firstLine="709"/>
-        <w:jc w:val="both"/>
-        <w:rPr>
-          <w:rFonts w:ascii="Times New Roman" w:hAnsi="Times New Roman" w:cs="Times New Roman"/>
-          <w:sz w:val="24"/>
-          <w:szCs w:val="24"/>
-          <w:lang w:val="bg-BG"/>
-        </w:rPr>
-      </w:pPr>
-      <w:r>
-        <w:rPr>
-          <w:rFonts w:cs="Times New Roman"/>
-          <w:sz w:val="24"/>
-          <w:szCs w:val="24"/>
-          <w:lang w:val="bg-BG"/>
-        </w:rPr>
       </w:r>
     </w:p>
     <w:p>
@@ -14480,24 +14359,23 @@
     <w:p>
       <w:pPr>
         <w:pStyle w:val="Normal"/>
-        <w:spacing w:before="0" w:after="160"/>
-        <w:rPr/>
-      </w:pPr>
-      <w:r>
-        <w:rPr/>
-      </w:r>
-      <w:r>
-        <w:br w:type="page"/>
-      </w:r>
-    </w:p>
-    <w:p>
-      <w:pPr>
-        <w:pStyle w:val="Normal"/>
-        <w:spacing w:before="0" w:after="160"/>
-        <w:rPr/>
-      </w:pPr>
-      <w:r>
-        <w:rPr/>
+        <w:spacing w:lineRule="auto" w:line="360" w:before="0" w:after="120"/>
+        <w:ind w:firstLine="709"/>
+        <w:jc w:val="both"/>
+        <w:rPr>
+          <w:rFonts w:cs="Times New Roman"/>
+          <w:sz w:val="24"/>
+          <w:szCs w:val="24"/>
+          <w:lang w:val="bg-BG"/>
+        </w:rPr>
+      </w:pPr>
+      <w:r>
+        <w:rPr>
+          <w:rFonts w:cs="Times New Roman"/>
+          <w:sz w:val="24"/>
+          <w:szCs w:val="24"/>
+          <w:lang w:val="bg-BG"/>
+        </w:rPr>
       </w:r>
     </w:p>
     <w:p>
@@ -14530,8 +14408,16 @@
       </w:pPr>
       <w:r>
         <w:rPr/>
-        <w:t>1. Основни характеристики и описание на MySQL:</w:t>
-      </w:r>
+        <w:t xml:space="preserve">1. Безплатен курс по HTML - </w:t>
+      </w:r>
+      <w:hyperlink r:id="rId3">
+        <w:r>
+          <w:rPr>
+            <w:rStyle w:val="Hyperlink"/>
+          </w:rPr>
+          <w:t>https://www.w3schools.com/html/default.asp</w:t>
+        </w:r>
+      </w:hyperlink>
     </w:p>
     <w:p>
       <w:pPr>
@@ -14541,7 +14427,6 @@
       </w:pPr>
       <w:r>
         <w:rPr/>
-        <w:t>https://en.wikipedia.org/wiki/MySQL?spm=a2ty_o01.29997173.0.0.44f44997ZVW2Z</w:t>
       </w:r>
     </w:p>
     <w:p>
@@ -14552,8 +14437,16 @@
       </w:pPr>
       <w:r>
         <w:rPr/>
-        <w:t>t</w:t>
-      </w:r>
+        <w:t xml:space="preserve">2.  Безплатен курс по CSS - </w:t>
+      </w:r>
+      <w:hyperlink r:id="rId4">
+        <w:r>
+          <w:rPr>
+            <w:rStyle w:val="Hyperlink"/>
+          </w:rPr>
+          <w:t>https://www.w3schools.com/css/default.asp</w:t>
+        </w:r>
+      </w:hyperlink>
     </w:p>
     <w:p>
       <w:pPr>
@@ -14563,7 +14456,6 @@
       </w:pPr>
       <w:r>
         <w:rPr/>
-        <w:t>2. HTML Tutorial:</w:t>
       </w:r>
     </w:p>
     <w:p>
@@ -14574,8 +14466,16 @@
       </w:pPr>
       <w:r>
         <w:rPr/>
-        <w:t>https://www.w3schools.com/html/?spm=a2ty_o01.29997173.0.0.44f44997bCcGHJ</w:t>
-      </w:r>
+        <w:t xml:space="preserve">3.  Безплатен курс по JavaScript - </w:t>
+      </w:r>
+      <w:hyperlink r:id="rId5">
+        <w:r>
+          <w:rPr>
+            <w:rStyle w:val="Hyperlink"/>
+          </w:rPr>
+          <w:t>https://www.w3schools.com/js/default.asp</w:t>
+        </w:r>
+      </w:hyperlink>
     </w:p>
     <w:p>
       <w:pPr>
@@ -14585,7 +14485,6 @@
       </w:pPr>
       <w:r>
         <w:rPr/>
-        <w:t>3. JavaScript Tutorial:</w:t>
       </w:r>
     </w:p>
     <w:p>
@@ -14596,8 +14495,16 @@
       </w:pPr>
       <w:r>
         <w:rPr/>
-        <w:t>https://javascript.info/?spm=a2ty_o01.29997173.0.0.44f44997bCcGHJ</w:t>
-      </w:r>
+        <w:t xml:space="preserve">4. Безплатен курс по SQL - </w:t>
+      </w:r>
+      <w:hyperlink r:id="rId6">
+        <w:r>
+          <w:rPr>
+            <w:rStyle w:val="Hyperlink"/>
+          </w:rPr>
+          <w:t>https://www.w3schools.com/sql/default.asp</w:t>
+        </w:r>
+      </w:hyperlink>
     </w:p>
     <w:p>
       <w:pPr>
@@ -14607,7 +14514,6 @@
       </w:pPr>
       <w:r>
         <w:rPr/>
-        <w:t>4. Описание и анализ на сървърните технологии като цяло:</w:t>
       </w:r>
     </w:p>
     <w:p>
@@ -14618,8 +14524,16 @@
       </w:pPr>
       <w:r>
         <w:rPr/>
-        <w:t>https://www.studysmarter.co.uk/explanations/computer-science/computer-network/ser</w:t>
-      </w:r>
+        <w:t xml:space="preserve">5. Безплатен курс по PHP - </w:t>
+      </w:r>
+      <w:hyperlink r:id="rId7">
+        <w:r>
+          <w:rPr>
+            <w:rStyle w:val="Hyperlink"/>
+          </w:rPr>
+          <w:t>https://www.w3schools.com/php/default.asp</w:t>
+        </w:r>
+      </w:hyperlink>
     </w:p>
     <w:p>
       <w:pPr>
@@ -14629,7 +14543,6 @@
       </w:pPr>
       <w:r>
         <w:rPr/>
-        <w:t>ver-side-technologies/?spm=a2ty_o01.29997173.0.0.44f44997bCcGHJ</w:t>
       </w:r>
     </w:p>
     <w:p>
@@ -14640,7 +14553,16 @@
       </w:pPr>
       <w:r>
         <w:rPr/>
-      </w:r>
+        <w:t xml:space="preserve">6. Безплатен курс за MariaDB - </w:t>
+      </w:r>
+      <w:hyperlink r:id="rId8">
+        <w:r>
+          <w:rPr>
+            <w:rStyle w:val="Hyperlink"/>
+          </w:rPr>
+          <w:t>https://youtube.com/playlist?list=PL3bGLnkkGnuUOB9YjjVDty6aCJApvkw8O&amp;si=6Yr5mGq-dzvdZhKP</w:t>
+        </w:r>
+      </w:hyperlink>
     </w:p>
     <w:p>
       <w:pPr>
@@ -14660,7 +14582,16 @@
       </w:pPr>
       <w:r>
         <w:rPr/>
-      </w:r>
+        <w:t xml:space="preserve">7. Безплатен курс за PHP (YouTube) - </w:t>
+      </w:r>
+      <w:hyperlink r:id="rId9">
+        <w:r>
+          <w:rPr>
+            <w:rStyle w:val="Hyperlink"/>
+          </w:rPr>
+          <w:t>https://youtube.com/playlist?list=PL0eyrZgxdwhwwQQZA79OzYwl5ewA7HQih&amp;si=lzkf148_OJNFKZ9x</w:t>
+        </w:r>
+      </w:hyperlink>
     </w:p>
     <w:p>
       <w:pPr>
@@ -14670,7 +14601,55 @@
       </w:pPr>
       <w:r>
         <w:rPr/>
-        <w:t>-primerni iztochnici, sloji istinskite posle</w:t>
+      </w:r>
+    </w:p>
+    <w:p>
+      <w:pPr>
+        <w:pStyle w:val="Normal"/>
+        <w:spacing w:before="0" w:after="160"/>
+        <w:rPr/>
+      </w:pPr>
+      <w:r>
+        <w:rPr/>
+        <w:t xml:space="preserve">8. Идея за дизайн на сайта - </w:t>
+      </w:r>
+      <w:hyperlink r:id="rId10">
+        <w:r>
+          <w:rPr>
+            <w:rStyle w:val="Hyperlink"/>
+          </w:rPr>
+          <w:t>https://www.apple.com/iphone/</w:t>
+        </w:r>
+      </w:hyperlink>
+    </w:p>
+    <w:p>
+      <w:pPr>
+        <w:pStyle w:val="Normal"/>
+        <w:spacing w:before="0" w:after="160"/>
+        <w:rPr/>
+      </w:pPr>
+      <w:r>
+        <w:rPr/>
+      </w:r>
+    </w:p>
+    <w:p>
+      <w:pPr>
+        <w:pStyle w:val="Normal"/>
+        <w:spacing w:before="0" w:after="160"/>
+        <w:rPr/>
+      </w:pPr>
+      <w:r>
+        <w:rPr/>
+      </w:r>
+    </w:p>
+    <w:p>
+      <w:pPr>
+        <w:pStyle w:val="Normal"/>
+        <w:spacing w:before="0" w:after="160"/>
+        <w:rPr/>
+      </w:pPr>
+      <w:r>
+        <w:rPr/>
       </w:r>
     </w:p>
     <w:p>
@@ -14728,25 +14707,925 @@
     </w:p>
     <w:p>
       <w:pPr>
+        <w:pStyle w:val="Heading2"/>
+        <w:rPr/>
+      </w:pPr>
+      <w:bookmarkStart w:id="26" w:name="__RefHeading___Toc1186_3808462378"/>
+      <w:bookmarkEnd w:id="26"/>
+      <w:r>
+        <w:rPr/>
+        <w:t>5.1. Начална страница в светъл и тъмен вариант</w:t>
+      </w:r>
+    </w:p>
+    <w:p>
+      <w:pPr>
+        <w:pStyle w:val="Normal"/>
+        <w:rPr/>
+      </w:pPr>
+      <w:r>
+        <w:rPr/>
+      </w:r>
+    </w:p>
+    <w:p>
+      <w:pPr>
+        <w:pStyle w:val="Normal"/>
+        <w:rPr/>
+      </w:pPr>
+      <w:r>
+        <w:drawing>
+          <wp:anchor distT="0" distB="0" distL="0" distR="0" simplePos="0" relativeHeight="2" behindDoc="0" locked="0" layoutInCell="0" allowOverlap="1">
+            <wp:simplePos x="0" y="0"/>
+            <wp:positionH relativeFrom="column">
+              <wp:align>center</wp:align>
+            </wp:positionH>
+            <wp:positionV relativeFrom="paragraph">
+              <wp:posOffset>635</wp:posOffset>
+            </wp:positionV>
+            <wp:extent cx="5760720" cy="3240405"/>
+            <wp:effectExtent l="0" t="0" r="0" b="0"/>
+            <wp:wrapSquare wrapText="largest"/>
+            <wp:docPr id="2" name="Image2"/>
+            <wp:cNvGraphicFramePr>
+              <a:graphicFrameLocks xmlns:a="http://schemas.openxmlformats.org/drawingml/2006/main" noChangeAspect="1"/>
+            </wp:cNvGraphicFramePr>
+            <a:graphic xmlns:a="http://schemas.openxmlformats.org/drawingml/2006/main">
+              <a:graphicData uri="http://schemas.openxmlformats.org/drawingml/2006/picture">
+                <pic:pic xmlns:pic="http://schemas.openxmlformats.org/drawingml/2006/picture">
+                  <pic:nvPicPr>
+                    <pic:cNvPr id="2" name="Image2"/>
+                    <pic:cNvPicPr>
+                      <a:picLocks noChangeAspect="1" noChangeArrowheads="1"/>
+                    </pic:cNvPicPr>
+                  </pic:nvPicPr>
+                  <pic:blipFill>
+                    <a:blip r:embed="rId11"/>
+                    <a:stretch>
+                      <a:fillRect/>
+                    </a:stretch>
+                  </pic:blipFill>
+                  <pic:spPr bwMode="auto">
+                    <a:xfrm>
+                      <a:off x="0" y="0"/>
+                      <a:ext cx="5760720" cy="3240405"/>
+                    </a:xfrm>
+                    <a:prstGeom prst="rect">
+                      <a:avLst/>
+                    </a:prstGeom>
+                    <a:noFill/>
+                  </pic:spPr>
+                </pic:pic>
+              </a:graphicData>
+            </a:graphic>
+          </wp:anchor>
+        </w:drawing>
+      </w:r>
+      <w:r>
+        <w:rPr/>
+        <w:t>.</w:t>
+      </w:r>
+    </w:p>
+    <w:p>
+      <w:pPr>
+        <w:pStyle w:val="Normal"/>
+        <w:rPr/>
+      </w:pPr>
+      <w:r>
+        <w:drawing>
+          <wp:anchor distT="0" distB="0" distL="0" distR="0" simplePos="0" relativeHeight="3" behindDoc="0" locked="0" layoutInCell="0" allowOverlap="1">
+            <wp:simplePos x="0" y="0"/>
+            <wp:positionH relativeFrom="column">
+              <wp:align>center</wp:align>
+            </wp:positionH>
+            <wp:positionV relativeFrom="paragraph">
+              <wp:posOffset>635</wp:posOffset>
+            </wp:positionV>
+            <wp:extent cx="5760720" cy="3240405"/>
+            <wp:effectExtent l="0" t="0" r="0" b="0"/>
+            <wp:wrapSquare wrapText="largest"/>
+            <wp:docPr id="3" name="Image3"/>
+            <wp:cNvGraphicFramePr>
+              <a:graphicFrameLocks xmlns:a="http://schemas.openxmlformats.org/drawingml/2006/main" noChangeAspect="1"/>
+            </wp:cNvGraphicFramePr>
+            <a:graphic xmlns:a="http://schemas.openxmlformats.org/drawingml/2006/main">
+              <a:graphicData uri="http://schemas.openxmlformats.org/drawingml/2006/picture">
+                <pic:pic xmlns:pic="http://schemas.openxmlformats.org/drawingml/2006/picture">
+                  <pic:nvPicPr>
+                    <pic:cNvPr id="3" name="Image3"/>
+                    <pic:cNvPicPr>
+                      <a:picLocks noChangeAspect="1" noChangeArrowheads="1"/>
+                    </pic:cNvPicPr>
+                  </pic:nvPicPr>
+                  <pic:blipFill>
+                    <a:blip r:embed="rId12"/>
+                    <a:stretch>
+                      <a:fillRect/>
+                    </a:stretch>
+                  </pic:blipFill>
+                  <pic:spPr bwMode="auto">
+                    <a:xfrm>
+                      <a:off x="0" y="0"/>
+                      <a:ext cx="5760720" cy="3240405"/>
+                    </a:xfrm>
+                    <a:prstGeom prst="rect">
+                      <a:avLst/>
+                    </a:prstGeom>
+                    <a:noFill/>
+                  </pic:spPr>
+                </pic:pic>
+              </a:graphicData>
+            </a:graphic>
+          </wp:anchor>
+        </w:drawing>
+      </w:r>
+      <w:r>
+        <w:rPr/>
+        <w:t>.</w:t>
+      </w:r>
+      <w:r>
+        <w:br w:type="page"/>
+      </w:r>
+    </w:p>
+    <w:p>
+      <w:pPr>
         <w:pStyle w:val="Normal"/>
         <w:spacing w:before="0" w:after="160"/>
         <w:rPr/>
       </w:pPr>
       <w:r>
         <w:rPr/>
-        <w:t>- тук ще сложа скрийншоти от самия сайт, но в момента нямам достатъчно вкарани продукти</w:t>
+      </w:r>
+    </w:p>
+    <w:p>
+      <w:pPr>
+        <w:pStyle w:val="Heading2"/>
+        <w:rPr/>
+      </w:pPr>
+      <w:bookmarkStart w:id="27" w:name="__RefHeading___Toc1188_3808462378"/>
+      <w:bookmarkEnd w:id="27"/>
+      <w:r>
+        <w:rPr/>
+        <w:t>5.2. Страница с продуктите в сайта</w:t>
+      </w:r>
+    </w:p>
+    <w:p>
+      <w:pPr>
+        <w:pStyle w:val="Normal"/>
+        <w:rPr/>
+      </w:pPr>
+      <w:r>
+        <w:drawing>
+          <wp:anchor distT="0" distB="0" distL="0" distR="0" simplePos="0" relativeHeight="4" behindDoc="0" locked="0" layoutInCell="0" allowOverlap="1">
+            <wp:simplePos x="0" y="0"/>
+            <wp:positionH relativeFrom="column">
+              <wp:posOffset>-69215</wp:posOffset>
+            </wp:positionH>
+            <wp:positionV relativeFrom="paragraph">
+              <wp:posOffset>59690</wp:posOffset>
+            </wp:positionV>
+            <wp:extent cx="5760720" cy="3240405"/>
+            <wp:effectExtent l="0" t="0" r="0" b="0"/>
+            <wp:wrapSquare wrapText="largest"/>
+            <wp:docPr id="4" name="Image4"/>
+            <wp:cNvGraphicFramePr>
+              <a:graphicFrameLocks xmlns:a="http://schemas.openxmlformats.org/drawingml/2006/main" noChangeAspect="1"/>
+            </wp:cNvGraphicFramePr>
+            <a:graphic xmlns:a="http://schemas.openxmlformats.org/drawingml/2006/main">
+              <a:graphicData uri="http://schemas.openxmlformats.org/drawingml/2006/picture">
+                <pic:pic xmlns:pic="http://schemas.openxmlformats.org/drawingml/2006/picture">
+                  <pic:nvPicPr>
+                    <pic:cNvPr id="4" name="Image4"/>
+                    <pic:cNvPicPr>
+                      <a:picLocks noChangeAspect="1" noChangeArrowheads="1"/>
+                    </pic:cNvPicPr>
+                  </pic:nvPicPr>
+                  <pic:blipFill>
+                    <a:blip r:embed="rId13"/>
+                    <a:stretch>
+                      <a:fillRect/>
+                    </a:stretch>
+                  </pic:blipFill>
+                  <pic:spPr bwMode="auto">
+                    <a:xfrm>
+                      <a:off x="0" y="0"/>
+                      <a:ext cx="5760720" cy="3240405"/>
+                    </a:xfrm>
+                    <a:prstGeom prst="rect">
+                      <a:avLst/>
+                    </a:prstGeom>
+                    <a:noFill/>
+                  </pic:spPr>
+                </pic:pic>
+              </a:graphicData>
+            </a:graphic>
+          </wp:anchor>
+        </w:drawing>
+      </w:r>
+      <w:r>
+        <w:rPr/>
+        <w:t>.</w:t>
+      </w:r>
+    </w:p>
+    <w:p>
+      <w:pPr>
+        <w:pStyle w:val="Normal"/>
+        <w:rPr/>
+      </w:pPr>
+      <w:r>
+        <w:rPr/>
+      </w:r>
+    </w:p>
+    <w:p>
+      <w:pPr>
+        <w:pStyle w:val="Normal"/>
+        <w:rPr/>
+      </w:pPr>
+      <w:r>
+        <w:rPr/>
+      </w:r>
+    </w:p>
+    <w:p>
+      <w:pPr>
+        <w:pStyle w:val="Heading2"/>
+        <w:rPr/>
+      </w:pPr>
+      <w:bookmarkStart w:id="28" w:name="__RefHeading___Toc1190_3808462378"/>
+      <w:bookmarkEnd w:id="28"/>
+      <w:r>
+        <w:rPr/>
+        <w:t>5.3. Страница на отделен продукт</w:t>
+      </w:r>
+    </w:p>
+    <w:p>
+      <w:pPr>
+        <w:pStyle w:val="Normal"/>
+        <w:rPr/>
+      </w:pPr>
+      <w:r>
+        <w:drawing>
+          <wp:anchor distT="0" distB="0" distL="0" distR="0" simplePos="0" relativeHeight="5" behindDoc="0" locked="0" layoutInCell="0" allowOverlap="1">
+            <wp:simplePos x="0" y="0"/>
+            <wp:positionH relativeFrom="column">
+              <wp:align>center</wp:align>
+            </wp:positionH>
+            <wp:positionV relativeFrom="paragraph">
+              <wp:posOffset>635</wp:posOffset>
+            </wp:positionV>
+            <wp:extent cx="5760720" cy="3240405"/>
+            <wp:effectExtent l="0" t="0" r="0" b="0"/>
+            <wp:wrapSquare wrapText="largest"/>
+            <wp:docPr id="5" name="Image5"/>
+            <wp:cNvGraphicFramePr>
+              <a:graphicFrameLocks xmlns:a="http://schemas.openxmlformats.org/drawingml/2006/main" noChangeAspect="1"/>
+            </wp:cNvGraphicFramePr>
+            <a:graphic xmlns:a="http://schemas.openxmlformats.org/drawingml/2006/main">
+              <a:graphicData uri="http://schemas.openxmlformats.org/drawingml/2006/picture">
+                <pic:pic xmlns:pic="http://schemas.openxmlformats.org/drawingml/2006/picture">
+                  <pic:nvPicPr>
+                    <pic:cNvPr id="5" name="Image5"/>
+                    <pic:cNvPicPr>
+                      <a:picLocks noChangeAspect="1" noChangeArrowheads="1"/>
+                    </pic:cNvPicPr>
+                  </pic:nvPicPr>
+                  <pic:blipFill>
+                    <a:blip r:embed="rId14"/>
+                    <a:stretch>
+                      <a:fillRect/>
+                    </a:stretch>
+                  </pic:blipFill>
+                  <pic:spPr bwMode="auto">
+                    <a:xfrm>
+                      <a:off x="0" y="0"/>
+                      <a:ext cx="5760720" cy="3240405"/>
+                    </a:xfrm>
+                    <a:prstGeom prst="rect">
+                      <a:avLst/>
+                    </a:prstGeom>
+                    <a:noFill/>
+                  </pic:spPr>
+                </pic:pic>
+              </a:graphicData>
+            </a:graphic>
+          </wp:anchor>
+        </w:drawing>
+      </w:r>
+      <w:r>
+        <w:rPr/>
+        <w:t>.</w:t>
+      </w:r>
+      <w:r>
+        <w:br w:type="page"/>
+      </w:r>
+    </w:p>
+    <w:p>
+      <w:pPr>
+        <w:pStyle w:val="Normal"/>
+        <w:spacing w:before="0" w:after="160"/>
+        <w:rPr/>
+      </w:pPr>
+      <w:r>
+        <w:rPr/>
+      </w:r>
+    </w:p>
+    <w:p>
+      <w:pPr>
+        <w:pStyle w:val="Heading2"/>
+        <w:rPr/>
+      </w:pPr>
+      <w:bookmarkStart w:id="29" w:name="__RefHeading___Toc1192_3808462378"/>
+      <w:bookmarkEnd w:id="29"/>
+      <w:r>
+        <w:rPr/>
+        <w:t>5.4. Страница с любими</w:t>
+      </w:r>
+    </w:p>
+    <w:p>
+      <w:pPr>
+        <w:pStyle w:val="Normal"/>
+        <w:rPr/>
+      </w:pPr>
+      <w:r>
+        <w:drawing>
+          <wp:anchor distT="0" distB="0" distL="0" distR="0" simplePos="0" relativeHeight="6" behindDoc="0" locked="0" layoutInCell="0" allowOverlap="1">
+            <wp:simplePos x="0" y="0"/>
+            <wp:positionH relativeFrom="column">
+              <wp:align>center</wp:align>
+            </wp:positionH>
+            <wp:positionV relativeFrom="paragraph">
+              <wp:posOffset>635</wp:posOffset>
+            </wp:positionV>
+            <wp:extent cx="5760720" cy="3240405"/>
+            <wp:effectExtent l="0" t="0" r="0" b="0"/>
+            <wp:wrapSquare wrapText="largest"/>
+            <wp:docPr id="6" name="Image6"/>
+            <wp:cNvGraphicFramePr>
+              <a:graphicFrameLocks xmlns:a="http://schemas.openxmlformats.org/drawingml/2006/main" noChangeAspect="1"/>
+            </wp:cNvGraphicFramePr>
+            <a:graphic xmlns:a="http://schemas.openxmlformats.org/drawingml/2006/main">
+              <a:graphicData uri="http://schemas.openxmlformats.org/drawingml/2006/picture">
+                <pic:pic xmlns:pic="http://schemas.openxmlformats.org/drawingml/2006/picture">
+                  <pic:nvPicPr>
+                    <pic:cNvPr id="6" name="Image6"/>
+                    <pic:cNvPicPr>
+                      <a:picLocks noChangeAspect="1" noChangeArrowheads="1"/>
+                    </pic:cNvPicPr>
+                  </pic:nvPicPr>
+                  <pic:blipFill>
+                    <a:blip r:embed="rId15"/>
+                    <a:stretch>
+                      <a:fillRect/>
+                    </a:stretch>
+                  </pic:blipFill>
+                  <pic:spPr bwMode="auto">
+                    <a:xfrm>
+                      <a:off x="0" y="0"/>
+                      <a:ext cx="5760720" cy="3240405"/>
+                    </a:xfrm>
+                    <a:prstGeom prst="rect">
+                      <a:avLst/>
+                    </a:prstGeom>
+                    <a:noFill/>
+                  </pic:spPr>
+                </pic:pic>
+              </a:graphicData>
+            </a:graphic>
+          </wp:anchor>
+        </w:drawing>
+      </w:r>
+      <w:r>
+        <w:rPr/>
+        <w:t>.</w:t>
+      </w:r>
+    </w:p>
+    <w:p>
+      <w:pPr>
+        <w:pStyle w:val="Normal"/>
+        <w:rPr/>
+      </w:pPr>
+      <w:r>
+        <w:rPr/>
+      </w:r>
+    </w:p>
+    <w:p>
+      <w:pPr>
+        <w:pStyle w:val="Normal"/>
+        <w:rPr/>
+      </w:pPr>
+      <w:r>
+        <w:rPr/>
+      </w:r>
+    </w:p>
+    <w:p>
+      <w:pPr>
+        <w:pStyle w:val="Heading2"/>
+        <w:rPr/>
+      </w:pPr>
+      <w:bookmarkStart w:id="30" w:name="__RefHeading___Toc1194_3808462378"/>
+      <w:bookmarkEnd w:id="30"/>
+      <w:r>
+        <w:rPr/>
+        <w:t>5.5. Страница с количка на клиент</w:t>
+      </w:r>
+    </w:p>
+    <w:p>
+      <w:pPr>
+        <w:pStyle w:val="Normal"/>
+        <w:rPr/>
+      </w:pPr>
+      <w:r>
+        <w:drawing>
+          <wp:anchor distT="0" distB="0" distL="0" distR="0" simplePos="0" relativeHeight="7" behindDoc="0" locked="0" layoutInCell="0" allowOverlap="1">
+            <wp:simplePos x="0" y="0"/>
+            <wp:positionH relativeFrom="column">
+              <wp:align>center</wp:align>
+            </wp:positionH>
+            <wp:positionV relativeFrom="paragraph">
+              <wp:posOffset>635</wp:posOffset>
+            </wp:positionV>
+            <wp:extent cx="5760720" cy="3240405"/>
+            <wp:effectExtent l="0" t="0" r="0" b="0"/>
+            <wp:wrapSquare wrapText="largest"/>
+            <wp:docPr id="7" name="Image7"/>
+            <wp:cNvGraphicFramePr>
+              <a:graphicFrameLocks xmlns:a="http://schemas.openxmlformats.org/drawingml/2006/main" noChangeAspect="1"/>
+            </wp:cNvGraphicFramePr>
+            <a:graphic xmlns:a="http://schemas.openxmlformats.org/drawingml/2006/main">
+              <a:graphicData uri="http://schemas.openxmlformats.org/drawingml/2006/picture">
+                <pic:pic xmlns:pic="http://schemas.openxmlformats.org/drawingml/2006/picture">
+                  <pic:nvPicPr>
+                    <pic:cNvPr id="7" name="Image7"/>
+                    <pic:cNvPicPr>
+                      <a:picLocks noChangeAspect="1" noChangeArrowheads="1"/>
+                    </pic:cNvPicPr>
+                  </pic:nvPicPr>
+                  <pic:blipFill>
+                    <a:blip r:embed="rId16"/>
+                    <a:stretch>
+                      <a:fillRect/>
+                    </a:stretch>
+                  </pic:blipFill>
+                  <pic:spPr bwMode="auto">
+                    <a:xfrm>
+                      <a:off x="0" y="0"/>
+                      <a:ext cx="5760720" cy="3240405"/>
+                    </a:xfrm>
+                    <a:prstGeom prst="rect">
+                      <a:avLst/>
+                    </a:prstGeom>
+                    <a:noFill/>
+                  </pic:spPr>
+                </pic:pic>
+              </a:graphicData>
+            </a:graphic>
+          </wp:anchor>
+        </w:drawing>
+      </w:r>
+      <w:r>
+        <w:rPr/>
+        <w:t>.</w:t>
+      </w:r>
+    </w:p>
+    <w:p>
+      <w:pPr>
+        <w:pStyle w:val="Normal"/>
+        <w:rPr/>
+      </w:pPr>
+      <w:r>
+        <w:rPr/>
+      </w:r>
+      <w:r>
+        <w:br w:type="page"/>
+      </w:r>
+    </w:p>
+    <w:p>
+      <w:pPr>
+        <w:pStyle w:val="Normal"/>
+        <w:spacing w:before="0" w:after="160"/>
+        <w:rPr/>
+      </w:pPr>
+      <w:r>
+        <w:rPr/>
+      </w:r>
+    </w:p>
+    <w:p>
+      <w:pPr>
+        <w:pStyle w:val="Heading2"/>
+        <w:rPr/>
+      </w:pPr>
+      <w:bookmarkStart w:id="31" w:name="__RefHeading___Toc1196_3808462378"/>
+      <w:bookmarkEnd w:id="31"/>
+      <w:r>
+        <w:rPr/>
+        <w:t>5.6. Страница с поръчки на клиент</w:t>
+      </w:r>
+    </w:p>
+    <w:p>
+      <w:pPr>
+        <w:pStyle w:val="Normal"/>
+        <w:rPr/>
+      </w:pPr>
+      <w:r>
+        <w:drawing>
+          <wp:anchor distT="0" distB="0" distL="0" distR="0" simplePos="0" relativeHeight="8" behindDoc="0" locked="0" layoutInCell="0" allowOverlap="1">
+            <wp:simplePos x="0" y="0"/>
+            <wp:positionH relativeFrom="column">
+              <wp:align>center</wp:align>
+            </wp:positionH>
+            <wp:positionV relativeFrom="paragraph">
+              <wp:posOffset>635</wp:posOffset>
+            </wp:positionV>
+            <wp:extent cx="5760720" cy="3240405"/>
+            <wp:effectExtent l="0" t="0" r="0" b="0"/>
+            <wp:wrapSquare wrapText="largest"/>
+            <wp:docPr id="8" name="Image8"/>
+            <wp:cNvGraphicFramePr>
+              <a:graphicFrameLocks xmlns:a="http://schemas.openxmlformats.org/drawingml/2006/main" noChangeAspect="1"/>
+            </wp:cNvGraphicFramePr>
+            <a:graphic xmlns:a="http://schemas.openxmlformats.org/drawingml/2006/main">
+              <a:graphicData uri="http://schemas.openxmlformats.org/drawingml/2006/picture">
+                <pic:pic xmlns:pic="http://schemas.openxmlformats.org/drawingml/2006/picture">
+                  <pic:nvPicPr>
+                    <pic:cNvPr id="8" name="Image8"/>
+                    <pic:cNvPicPr>
+                      <a:picLocks noChangeAspect="1" noChangeArrowheads="1"/>
+                    </pic:cNvPicPr>
+                  </pic:nvPicPr>
+                  <pic:blipFill>
+                    <a:blip r:embed="rId17"/>
+                    <a:stretch>
+                      <a:fillRect/>
+                    </a:stretch>
+                  </pic:blipFill>
+                  <pic:spPr bwMode="auto">
+                    <a:xfrm>
+                      <a:off x="0" y="0"/>
+                      <a:ext cx="5760720" cy="3240405"/>
+                    </a:xfrm>
+                    <a:prstGeom prst="rect">
+                      <a:avLst/>
+                    </a:prstGeom>
+                    <a:noFill/>
+                  </pic:spPr>
+                </pic:pic>
+              </a:graphicData>
+            </a:graphic>
+          </wp:anchor>
+        </w:drawing>
+      </w:r>
+      <w:r>
+        <w:rPr/>
+        <w:t>.</w:t>
+      </w:r>
+    </w:p>
+    <w:p>
+      <w:pPr>
+        <w:pStyle w:val="Normal"/>
+        <w:rPr/>
+      </w:pPr>
+      <w:r>
+        <w:rPr/>
+      </w:r>
+    </w:p>
+    <w:p>
+      <w:pPr>
+        <w:pStyle w:val="Heading2"/>
+        <w:rPr/>
+      </w:pPr>
+      <w:bookmarkStart w:id="32" w:name="__RefHeading___Toc1198_3808462378"/>
+      <w:bookmarkEnd w:id="32"/>
+      <w:r>
+        <w:rPr/>
+        <w:t>5.7. Страница с новини</w:t>
+      </w:r>
+    </w:p>
+    <w:p>
+      <w:pPr>
+        <w:pStyle w:val="Normal"/>
+        <w:rPr/>
+      </w:pPr>
+      <w:r>
+        <w:drawing>
+          <wp:anchor distT="0" distB="0" distL="0" distR="0" simplePos="0" relativeHeight="9" behindDoc="0" locked="0" layoutInCell="0" allowOverlap="1">
+            <wp:simplePos x="0" y="0"/>
+            <wp:positionH relativeFrom="column">
+              <wp:align>center</wp:align>
+            </wp:positionH>
+            <wp:positionV relativeFrom="paragraph">
+              <wp:posOffset>635</wp:posOffset>
+            </wp:positionV>
+            <wp:extent cx="5760720" cy="3240405"/>
+            <wp:effectExtent l="0" t="0" r="0" b="0"/>
+            <wp:wrapSquare wrapText="largest"/>
+            <wp:docPr id="9" name="Image9"/>
+            <wp:cNvGraphicFramePr>
+              <a:graphicFrameLocks xmlns:a="http://schemas.openxmlformats.org/drawingml/2006/main" noChangeAspect="1"/>
+            </wp:cNvGraphicFramePr>
+            <a:graphic xmlns:a="http://schemas.openxmlformats.org/drawingml/2006/main">
+              <a:graphicData uri="http://schemas.openxmlformats.org/drawingml/2006/picture">
+                <pic:pic xmlns:pic="http://schemas.openxmlformats.org/drawingml/2006/picture">
+                  <pic:nvPicPr>
+                    <pic:cNvPr id="9" name="Image9"/>
+                    <pic:cNvPicPr>
+                      <a:picLocks noChangeAspect="1" noChangeArrowheads="1"/>
+                    </pic:cNvPicPr>
+                  </pic:nvPicPr>
+                  <pic:blipFill>
+                    <a:blip r:embed="rId18"/>
+                    <a:stretch>
+                      <a:fillRect/>
+                    </a:stretch>
+                  </pic:blipFill>
+                  <pic:spPr bwMode="auto">
+                    <a:xfrm>
+                      <a:off x="0" y="0"/>
+                      <a:ext cx="5760720" cy="3240405"/>
+                    </a:xfrm>
+                    <a:prstGeom prst="rect">
+                      <a:avLst/>
+                    </a:prstGeom>
+                    <a:noFill/>
+                  </pic:spPr>
+                </pic:pic>
+              </a:graphicData>
+            </a:graphic>
+          </wp:anchor>
+        </w:drawing>
+      </w:r>
+      <w:r>
+        <w:rPr/>
+        <w:t>.</w:t>
+      </w:r>
+    </w:p>
+    <w:p>
+      <w:pPr>
+        <w:pStyle w:val="Normal"/>
+        <w:rPr/>
+      </w:pPr>
+      <w:r>
+        <w:rPr/>
+      </w:r>
+      <w:r>
+        <w:br w:type="page"/>
+      </w:r>
+    </w:p>
+    <w:p>
+      <w:pPr>
+        <w:pStyle w:val="Normal"/>
+        <w:spacing w:before="0" w:after="160"/>
+        <w:rPr/>
+      </w:pPr>
+      <w:r>
+        <w:rPr/>
+      </w:r>
+    </w:p>
+    <w:p>
+      <w:pPr>
+        <w:pStyle w:val="Heading2"/>
+        <w:rPr/>
+      </w:pPr>
+      <w:bookmarkStart w:id="33" w:name="__RefHeading___Toc1200_3808462378"/>
+      <w:bookmarkEnd w:id="33"/>
+      <w:r>
+        <w:rPr/>
+        <w:t>5.8. Администраторска страница</w:t>
+      </w:r>
+    </w:p>
+    <w:p>
+      <w:pPr>
+        <w:pStyle w:val="Normal"/>
+        <w:rPr/>
+      </w:pPr>
+      <w:r>
+        <w:drawing>
+          <wp:anchor distT="0" distB="0" distL="0" distR="0" simplePos="0" relativeHeight="10" behindDoc="0" locked="0" layoutInCell="0" allowOverlap="1">
+            <wp:simplePos x="0" y="0"/>
+            <wp:positionH relativeFrom="column">
+              <wp:align>center</wp:align>
+            </wp:positionH>
+            <wp:positionV relativeFrom="paragraph">
+              <wp:posOffset>635</wp:posOffset>
+            </wp:positionV>
+            <wp:extent cx="5760720" cy="3240405"/>
+            <wp:effectExtent l="0" t="0" r="0" b="0"/>
+            <wp:wrapSquare wrapText="largest"/>
+            <wp:docPr id="10" name="Image10"/>
+            <wp:cNvGraphicFramePr>
+              <a:graphicFrameLocks xmlns:a="http://schemas.openxmlformats.org/drawingml/2006/main" noChangeAspect="1"/>
+            </wp:cNvGraphicFramePr>
+            <a:graphic xmlns:a="http://schemas.openxmlformats.org/drawingml/2006/main">
+              <a:graphicData uri="http://schemas.openxmlformats.org/drawingml/2006/picture">
+                <pic:pic xmlns:pic="http://schemas.openxmlformats.org/drawingml/2006/picture">
+                  <pic:nvPicPr>
+                    <pic:cNvPr id="10" name="Image10"/>
+                    <pic:cNvPicPr>
+                      <a:picLocks noChangeAspect="1" noChangeArrowheads="1"/>
+                    </pic:cNvPicPr>
+                  </pic:nvPicPr>
+                  <pic:blipFill>
+                    <a:blip r:embed="rId19"/>
+                    <a:stretch>
+                      <a:fillRect/>
+                    </a:stretch>
+                  </pic:blipFill>
+                  <pic:spPr bwMode="auto">
+                    <a:xfrm>
+                      <a:off x="0" y="0"/>
+                      <a:ext cx="5760720" cy="3240405"/>
+                    </a:xfrm>
+                    <a:prstGeom prst="rect">
+                      <a:avLst/>
+                    </a:prstGeom>
+                    <a:noFill/>
+                  </pic:spPr>
+                </pic:pic>
+              </a:graphicData>
+            </a:graphic>
+          </wp:anchor>
+        </w:drawing>
+      </w:r>
+      <w:r>
+        <w:rPr/>
+        <w:t>.</w:t>
+      </w:r>
+    </w:p>
+    <w:p>
+      <w:pPr>
+        <w:pStyle w:val="Normal"/>
+        <w:rPr/>
+      </w:pPr>
+      <w:r>
+        <w:rPr/>
+      </w:r>
+    </w:p>
+    <w:p>
+      <w:pPr>
+        <w:pStyle w:val="Heading2"/>
+        <w:rPr/>
+      </w:pPr>
+      <w:bookmarkStart w:id="34" w:name="__RefHeading___Toc1202_3808462378"/>
+      <w:bookmarkEnd w:id="34"/>
+      <w:r>
+        <w:rPr/>
+        <w:t>5.9. Страница с всички поръчки (Администратор)</w:t>
+      </w:r>
+    </w:p>
+    <w:p>
+      <w:pPr>
+        <w:pStyle w:val="Normal"/>
+        <w:rPr/>
+      </w:pPr>
+      <w:r>
+        <w:drawing>
+          <wp:anchor distT="0" distB="0" distL="0" distR="0" simplePos="0" relativeHeight="11" behindDoc="0" locked="0" layoutInCell="0" allowOverlap="1">
+            <wp:simplePos x="0" y="0"/>
+            <wp:positionH relativeFrom="column">
+              <wp:align>center</wp:align>
+            </wp:positionH>
+            <wp:positionV relativeFrom="paragraph">
+              <wp:posOffset>635</wp:posOffset>
+            </wp:positionV>
+            <wp:extent cx="5760720" cy="3240405"/>
+            <wp:effectExtent l="0" t="0" r="0" b="0"/>
+            <wp:wrapSquare wrapText="largest"/>
+            <wp:docPr id="11" name="Image11"/>
+            <wp:cNvGraphicFramePr>
+              <a:graphicFrameLocks xmlns:a="http://schemas.openxmlformats.org/drawingml/2006/main" noChangeAspect="1"/>
+            </wp:cNvGraphicFramePr>
+            <a:graphic xmlns:a="http://schemas.openxmlformats.org/drawingml/2006/main">
+              <a:graphicData uri="http://schemas.openxmlformats.org/drawingml/2006/picture">
+                <pic:pic xmlns:pic="http://schemas.openxmlformats.org/drawingml/2006/picture">
+                  <pic:nvPicPr>
+                    <pic:cNvPr id="11" name="Image11"/>
+                    <pic:cNvPicPr>
+                      <a:picLocks noChangeAspect="1" noChangeArrowheads="1"/>
+                    </pic:cNvPicPr>
+                  </pic:nvPicPr>
+                  <pic:blipFill>
+                    <a:blip r:embed="rId20"/>
+                    <a:stretch>
+                      <a:fillRect/>
+                    </a:stretch>
+                  </pic:blipFill>
+                  <pic:spPr bwMode="auto">
+                    <a:xfrm>
+                      <a:off x="0" y="0"/>
+                      <a:ext cx="5760720" cy="3240405"/>
+                    </a:xfrm>
+                    <a:prstGeom prst="rect">
+                      <a:avLst/>
+                    </a:prstGeom>
+                    <a:noFill/>
+                  </pic:spPr>
+                </pic:pic>
+              </a:graphicData>
+            </a:graphic>
+          </wp:anchor>
+        </w:drawing>
+      </w:r>
+      <w:r>
+        <w:rPr/>
+        <w:t>.</w:t>
+      </w:r>
+    </w:p>
+    <w:p>
+      <w:pPr>
+        <w:pStyle w:val="Normal"/>
+        <w:rPr/>
+      </w:pPr>
+      <w:r>
+        <w:rPr/>
+      </w:r>
+      <w:r>
+        <w:br w:type="page"/>
+      </w:r>
+    </w:p>
+    <w:p>
+      <w:pPr>
+        <w:pStyle w:val="Normal"/>
+        <w:spacing w:before="0" w:after="160"/>
+        <w:rPr/>
+      </w:pPr>
+      <w:r>
+        <w:rPr/>
+      </w:r>
+    </w:p>
+    <w:p>
+      <w:pPr>
+        <w:pStyle w:val="Heading2"/>
+        <w:rPr/>
+      </w:pPr>
+      <w:bookmarkStart w:id="35" w:name="__RefHeading___Toc1204_3808462378"/>
+      <w:bookmarkEnd w:id="35"/>
+      <w:r>
+        <w:rPr/>
+        <w:t>5.10. Структура на базата данни</w:t>
+      </w:r>
+    </w:p>
+    <w:p>
+      <w:pPr>
+        <w:pStyle w:val="Normal"/>
+        <w:spacing w:before="0" w:after="160"/>
+        <w:rPr/>
+      </w:pPr>
+      <w:r>
+        <w:rPr/>
+        <w:drawing>
+          <wp:anchor distT="0" distB="0" distL="0" distR="0" simplePos="0" relativeHeight="12" behindDoc="0" locked="0" layoutInCell="0" allowOverlap="1">
+            <wp:simplePos x="0" y="0"/>
+            <wp:positionH relativeFrom="column">
+              <wp:align>center</wp:align>
+            </wp:positionH>
+            <wp:positionV relativeFrom="paragraph">
+              <wp:posOffset>635</wp:posOffset>
+            </wp:positionV>
+            <wp:extent cx="5760720" cy="4175760"/>
+            <wp:effectExtent l="0" t="0" r="0" b="0"/>
+            <wp:wrapSquare wrapText="largest"/>
+            <wp:docPr id="12" name="Image12"/>
+            <wp:cNvGraphicFramePr>
+              <a:graphicFrameLocks xmlns:a="http://schemas.openxmlformats.org/drawingml/2006/main" noChangeAspect="1"/>
+            </wp:cNvGraphicFramePr>
+            <a:graphic xmlns:a="http://schemas.openxmlformats.org/drawingml/2006/main">
+              <a:graphicData uri="http://schemas.openxmlformats.org/drawingml/2006/picture">
+                <pic:pic xmlns:pic="http://schemas.openxmlformats.org/drawingml/2006/picture">
+                  <pic:nvPicPr>
+                    <pic:cNvPr id="12" name="Image12"/>
+                    <pic:cNvPicPr>
+                      <a:picLocks noChangeAspect="1" noChangeArrowheads="1"/>
+                    </pic:cNvPicPr>
+                  </pic:nvPicPr>
+                  <pic:blipFill>
+                    <a:blip r:embed="rId21"/>
+                    <a:stretch>
+                      <a:fillRect/>
+                    </a:stretch>
+                  </pic:blipFill>
+                  <pic:spPr bwMode="auto">
+                    <a:xfrm>
+                      <a:off x="0" y="0"/>
+                      <a:ext cx="5760720" cy="4175760"/>
+                    </a:xfrm>
+                    <a:prstGeom prst="rect">
+                      <a:avLst/>
+                    </a:prstGeom>
+                    <a:noFill/>
+                  </pic:spPr>
+                </pic:pic>
+              </a:graphicData>
+            </a:graphic>
+          </wp:anchor>
+        </w:drawing>
       </w:r>
     </w:p>
     <w:sectPr>
-      <w:headerReference w:type="even" r:id="rId3"/>
-      <w:headerReference w:type="default" r:id="rId4"/>
-      <w:headerReference w:type="first" r:id="rId5"/>
-      <w:footerReference w:type="even" r:id="rId6"/>
-      <w:footerReference w:type="default" r:id="rId7"/>
-      <w:footerReference w:type="first" r:id="rId8"/>
+      <w:headerReference w:type="even" r:id="rId22"/>
+      <w:headerReference w:type="default" r:id="rId23"/>
+      <w:headerReference w:type="first" r:id="rId24"/>
+      <w:footerReference w:type="even" r:id="rId25"/>
+      <w:footerReference w:type="default" r:id="rId26"/>
+      <w:footerReference w:type="first" r:id="rId27"/>
       <w:type w:val="nextPage"/>
       <w:pgSz w:w="11906" w:h="16838"/>
-      <w:pgMar w:left="1417" w:right="1417" w:gutter="0" w:header="851" w:top="1687" w:footer="708" w:bottom="1267"/>
+      <w:pgMar w:left="1417" w:right="1417" w:gutter="0" w:header="851" w:top="1687" w:footer="708" w:bottom="1270"/>
       <w:pgNumType w:fmt="decimal"/>
       <w:formProt w:val="false"/>
       <w:titlePg/>
@@ -14782,7 +15661,7 @@
         <w:shd w:fill="auto" w:val="clear"/>
       </w:rPr>
     </w:pPr>
-    <w:bookmarkStart w:id="26" w:name="PageNumWizard_FOOTER_Default_Page_Style4"/>
+    <w:bookmarkStart w:id="36" w:name="PageNumWizard_FOOTER_Default_Page_Style4"/>
     <w:r>
       <w:rPr>
         <w:shd w:fill="auto" w:val="clear"/>
@@ -14805,7 +15684,7 @@
       <w:rPr>
         <w:shd w:fill="auto" w:val="clear"/>
       </w:rPr>
-      <w:t>51</w:t>
+      <w:t>52</w:t>
     </w:r>
     <w:r>
       <w:rPr>
@@ -14813,7 +15692,7 @@
       </w:rPr>
       <w:fldChar w:fldCharType="end"/>
     </w:r>
-    <w:bookmarkEnd w:id="26"/>
+    <w:bookmarkEnd w:id="36"/>
   </w:p>
   <w:p>
     <w:pPr>
@@ -14843,7 +15722,7 @@
         <w:shd w:fill="auto" w:val="clear"/>
       </w:rPr>
     </w:pPr>
-    <w:bookmarkStart w:id="27" w:name="PageNumWizard_FOOTER_Default_Page_Style1"/>
+    <w:bookmarkStart w:id="37" w:name="PageNumWizard_FOOTER_Default_Page_Style1"/>
     <w:r>
       <w:rPr>
         <w:shd w:fill="auto" w:val="clear"/>
@@ -14874,7 +15753,7 @@
       </w:rPr>
       <w:fldChar w:fldCharType="end"/>
     </w:r>
-    <w:bookmarkEnd w:id="27"/>
+    <w:bookmarkEnd w:id="37"/>
   </w:p>
 </w:ftr>
 </file>
@@ -14948,20 +15827,71 @@
 <w:hdr xmlns:o="urn:schemas-microsoft-com:office:office" xmlns:r="http://schemas.openxmlformats.org/officeDocument/2006/relationships" xmlns:v="urn:schemas-microsoft-com:vml" xmlns:w="http://schemas.openxmlformats.org/wordprocessingml/2006/main" xmlns:w10="urn:schemas-microsoft-com:office:word" xmlns:wp="http://schemas.openxmlformats.org/drawingml/2006/wordprocessingDrawing" xmlns:pic="http://schemas.openxmlformats.org/drawingml/2006/picture" xmlns:wps="http://schemas.microsoft.com/office/word/2010/wordprocessingShape" xmlns:wpg="http://schemas.microsoft.com/office/word/2010/wordprocessingGroup" xmlns:mc="http://schemas.openxmlformats.org/markup-compatibility/2006" xmlns:wp14="http://schemas.microsoft.com/office/word/2010/wordprocessingDrawing" xmlns:w14="http://schemas.microsoft.com/office/word/2010/wordml" xmlns:w15="http://schemas.microsoft.com/office/word/2012/wordml" mc:Ignorable="w14 wp14 w15">
   <w:p>
     <w:pPr>
-      <w:pStyle w:val="Header"/>
+      <w:pStyle w:val="Normal"/>
+      <w:spacing w:lineRule="auto" w:line="360" w:before="0" w:after="0"/>
       <w:jc w:val="center"/>
       <w:rPr>
         <w:b/>
         <w:bCs/>
-        <w:u w:val="single"/>
       </w:rPr>
     </w:pPr>
     <w:r>
+      <w:drawing>
+        <wp:anchor distT="0" distB="0" distL="0" distR="0" simplePos="0" relativeHeight="14" behindDoc="1" locked="0" layoutInCell="1" allowOverlap="1">
+          <wp:simplePos x="0" y="0"/>
+          <wp:positionH relativeFrom="column">
+            <wp:posOffset>-751205</wp:posOffset>
+          </wp:positionH>
+          <wp:positionV relativeFrom="paragraph">
+            <wp:posOffset>-280670</wp:posOffset>
+          </wp:positionV>
+          <wp:extent cx="679450" cy="679450"/>
+          <wp:effectExtent l="0" t="0" r="0" b="0"/>
+          <wp:wrapNone/>
+          <wp:docPr id="13" name="Picture 15"/>
+          <wp:cNvGraphicFramePr>
+            <a:graphicFrameLocks xmlns:a="http://schemas.openxmlformats.org/drawingml/2006/main" noChangeAspect="1"/>
+          </wp:cNvGraphicFramePr>
+          <a:graphic xmlns:a="http://schemas.openxmlformats.org/drawingml/2006/main">
+            <a:graphicData uri="http://schemas.openxmlformats.org/drawingml/2006/picture">
+              <pic:pic xmlns:pic="http://schemas.openxmlformats.org/drawingml/2006/picture">
+                <pic:nvPicPr>
+                  <pic:cNvPr id="13" name="Picture 15"/>
+                  <pic:cNvPicPr>
+                    <a:picLocks noChangeAspect="1" noChangeArrowheads="1"/>
+                  </pic:cNvPicPr>
+                </pic:nvPicPr>
+                <pic:blipFill>
+                  <a:blip r:embed="rId1"/>
+                  <a:stretch>
+                    <a:fillRect/>
+                  </a:stretch>
+                </pic:blipFill>
+                <pic:spPr bwMode="auto">
+                  <a:xfrm>
+                    <a:off x="0" y="0"/>
+                    <a:ext cx="679450" cy="679450"/>
+                  </a:xfrm>
+                  <a:prstGeom prst="rect">
+                    <a:avLst/>
+                  </a:prstGeom>
+                  <a:noFill/>
+                </pic:spPr>
+              </pic:pic>
+            </a:graphicData>
+          </a:graphic>
+        </wp:anchor>
+      </w:drawing>
+    </w:r>
+    <w:r>
       <w:rPr>
+        <w:rFonts w:cs="Times New Roman"/>
         <w:b/>
         <w:bCs/>
-        <w:u w:val="single"/>
+        <w:sz w:val="28"/>
+        <w:szCs w:val="28"/>
       </w:rPr>
+      <w:t>СОФИЙСКА ПРОФЕСИОНАЛНА ГИМНАЗИЯ ПО ЕЛЕКТРОНИКА „ДЖОН АТАНАСОВ“</w:t>
     </w:r>
   </w:p>
 </w:hdr>
@@ -15587,6 +16517,13 @@
     <w:name w:val="Index Link"/>
     <w:qFormat/>
     <w:rPr/>
+  </w:style>
+  <w:style w:type="character" w:styleId="FollowedHyperlink">
+    <w:name w:val="FollowedHyperlink"/>
+    <w:rPr>
+      <w:color w:val="800000"/>
+      <w:u w:val="single"/>
+    </w:rPr>
   </w:style>
   <w:style w:type="paragraph" w:styleId="Heading">
     <w:name w:val="Heading"/>

</xml_diff>